<commit_message>
Add 09300004 final competition release drafts
</commit_message>
<xml_diff>
--- a/决赛发布材料/09300004发布稿/01_智烤管家_湖北省创客大赛决赛双人发布稿_正式参赛版_09300004.docx
+++ b/决赛发布材料/09300004发布稿/01_智烤管家_湖北省创客大赛决赛双人发布稿_正式参赛版_09300004.docx
@@ -4,7 +4,6 @@
   <w:body>
     <w:p>
       <w:pPr>
-        <w:spacing w:after="200"/>
         <w:jc w:val="center"/>
       </w:pPr>
       <w:r>
@@ -18,15 +17,14 @@
     </w:p>
     <w:p>
       <w:pPr>
-        <w:spacing w:after="320"/>
         <w:jc w:val="center"/>
       </w:pPr>
       <w:r>
         <w:rPr>
           <w:rFonts w:ascii="仿宋_GB2312" w:hAnsi="仿宋_GB2312" w:eastAsia="仿宋_GB2312" w:cs="仿宋_GB2312"/>
           <w:b w:val="0"/>
-          <w:color w:val="5A5A5A"/>
-          <w:sz w:val="28"/>
+          <w:color w:val="505050"/>
+          <w:sz w:val="26"/>
         </w:rPr>
         <w:t>湖北省创客大赛决赛双人发布稿 · 正式参赛版 · 09300004</w:t>
       </w:r>
@@ -34,23 +32,19 @@
     <w:tbl>
       <w:tblPr>
         <w:tblW w:type="auto" w:w="0"/>
-        <w:jc w:val="center"/>
         <w:tblLook w:firstColumn="1" w:firstRow="1" w:lastColumn="0" w:lastRow="0" w:noHBand="0" w:noVBand="1" w:val="04A0"/>
       </w:tblPr>
       <w:tblGrid>
-        <w:gridCol w:w="9406"/>
+        <w:gridCol w:w="9632"/>
       </w:tblGrid>
       <w:tr>
         <w:tc>
           <w:tcPr>
-            <w:tcW w:type="dxa" w:w="9406"/>
+            <w:tcW w:type="dxa" w:w="9632"/>
             <w:shd w:fill="E2F0D9"/>
           </w:tcPr>
           <w:p>
-            <w:pPr>
-              <w:spacing w:after="0"/>
-              <w:ind w:left="85" w:right="85"/>
-            </w:pPr>
+            <w:r/>
             <w:r>
               <w:rPr>
                 <w:rFonts w:ascii="黑体" w:hAnsi="黑体" w:eastAsia="黑体" w:cs="黑体"/>
@@ -64,7 +58,7 @@
                 <w:rFonts w:ascii="楷体_GB2312" w:hAnsi="楷体_GB2312" w:eastAsia="楷体_GB2312" w:cs="楷体_GB2312"/>
                 <w:sz w:val="22"/>
               </w:rPr>
-              <w:t>正文口播约1759个汉字；A约1243字（70.7%），B约516字（29.3%）；建议视频35秒，整场目标7分40秒—7分55秒。B不承担大段技术讲解，主要负责提问、现场翻译和关键结论强化。</w:t>
+              <w:t>目标口播约7分30秒—7分50秒；A约1268个汉字、B约542个汉字，A占双人口播约70.1%。视频35秒。</w:t>
             </w:r>
           </w:p>
         </w:tc>
@@ -72,15 +66,15 @@
     </w:tbl>
     <w:p>
       <w:pPr>
-        <w:spacing w:after="0"/>
-      </w:pPr>
-    </w:p>
-    <w:p>
-      <w:pPr>
         <w:pStyle w:val="Heading1"/>
-        <w:spacing w:before="180" w:after="80"/>
+        <w:spacing w:before="160" w:after="80"/>
       </w:pPr>
       <w:r>
+        <w:rPr>
+          <w:rFonts w:ascii="黑体" w:hAnsi="黑体" w:eastAsia="黑体" w:cs="黑体"/>
+          <w:b/>
+          <w:sz w:val="36"/>
+        </w:rPr>
         <w:t>一、8分钟时间轴与PPT配合</w:t>
       </w:r>
     </w:p>
@@ -92,25 +86,25 @@
         <w:tblLook w:firstColumn="1" w:firstRow="1" w:lastColumn="0" w:lastRow="0" w:noHBand="0" w:noVBand="1" w:val="04A0"/>
       </w:tblPr>
       <w:tblGrid>
-        <w:gridCol w:w="3135"/>
-        <w:gridCol w:w="3135"/>
-        <w:gridCol w:w="3135"/>
+        <w:gridCol w:w="3211"/>
+        <w:gridCol w:w="3211"/>
+        <w:gridCol w:w="3211"/>
       </w:tblGrid>
       <w:tr>
         <w:tc>
           <w:tcPr>
-            <w:tcW w:type="dxa" w:w="3135"/>
+            <w:tcW w:type="dxa" w:w="3211"/>
             <w:vAlign w:val="center"/>
             <w:shd w:fill="D9E2F3"/>
           </w:tcPr>
           <w:p>
             <w:pPr>
-              <w:spacing w:after="0" w:line="264" w:lineRule="auto"/>
+              <w:spacing w:line="252" w:lineRule="auto"/>
             </w:pPr>
             <w:r/>
             <w:r>
               <w:rPr>
-                <w:rFonts w:ascii="黑体" w:hAnsi="黑体" w:eastAsia="黑体" w:cs="黑体"/>
+                <w:rFonts w:ascii="Noto Sans CJK SC" w:hAnsi="Noto Sans CJK SC" w:eastAsia="Noto Sans CJK SC" w:cs="Noto Sans CJK SC"/>
                 <w:b/>
                 <w:sz w:val="18"/>
               </w:rPr>
@@ -120,18 +114,18 @@
         </w:tc>
         <w:tc>
           <w:tcPr>
-            <w:tcW w:type="dxa" w:w="3135"/>
+            <w:tcW w:type="dxa" w:w="3211"/>
             <w:vAlign w:val="center"/>
             <w:shd w:fill="D9E2F3"/>
           </w:tcPr>
           <w:p>
             <w:pPr>
-              <w:spacing w:after="0" w:line="264" w:lineRule="auto"/>
+              <w:spacing w:line="252" w:lineRule="auto"/>
             </w:pPr>
             <w:r/>
             <w:r>
               <w:rPr>
-                <w:rFonts w:ascii="黑体" w:hAnsi="黑体" w:eastAsia="黑体" w:cs="黑体"/>
+                <w:rFonts w:ascii="Noto Sans CJK SC" w:hAnsi="Noto Sans CJK SC" w:eastAsia="Noto Sans CJK SC" w:cs="Noto Sans CJK SC"/>
                 <w:b/>
                 <w:sz w:val="18"/>
               </w:rPr>
@@ -141,18 +135,18 @@
         </w:tc>
         <w:tc>
           <w:tcPr>
-            <w:tcW w:type="dxa" w:w="3135"/>
+            <w:tcW w:type="dxa" w:w="3211"/>
             <w:vAlign w:val="center"/>
             <w:shd w:fill="D9E2F3"/>
           </w:tcPr>
           <w:p>
             <w:pPr>
-              <w:spacing w:after="0" w:line="264" w:lineRule="auto"/>
+              <w:spacing w:line="252" w:lineRule="auto"/>
             </w:pPr>
             <w:r/>
             <w:r>
               <w:rPr>
-                <w:rFonts w:ascii="黑体" w:hAnsi="黑体" w:eastAsia="黑体" w:cs="黑体"/>
+                <w:rFonts w:ascii="Noto Sans CJK SC" w:hAnsi="Noto Sans CJK SC" w:eastAsia="Noto Sans CJK SC" w:cs="Noto Sans CJK SC"/>
                 <w:b/>
                 <w:sz w:val="18"/>
               </w:rPr>
@@ -164,61 +158,61 @@
       <w:tr>
         <w:tc>
           <w:tcPr>
-            <w:tcW w:type="dxa" w:w="3135"/>
+            <w:tcW w:type="dxa" w:w="3211"/>
             <w:vAlign w:val="center"/>
           </w:tcPr>
           <w:p>
             <w:pPr>
-              <w:spacing w:after="0" w:line="264" w:lineRule="auto"/>
+              <w:spacing w:line="252" w:lineRule="auto"/>
             </w:pPr>
             <w:r/>
             <w:r>
               <w:rPr>
-                <w:rFonts w:ascii="仿宋_GB2312" w:hAnsi="仿宋_GB2312" w:eastAsia="仿宋_GB2312" w:cs="仿宋_GB2312"/>
+                <w:rFonts w:ascii="Noto Sans CJK SC" w:hAnsi="Noto Sans CJK SC" w:eastAsia="Noto Sans CJK SC" w:cs="Noto Sans CJK SC"/>
                 <w:b w:val="0"/>
                 <w:sz w:val="18"/>
               </w:rPr>
-              <w:t>0:00-0:55</w:t>
+              <w:t>0:00–0:55</w:t>
             </w:r>
           </w:p>
         </w:tc>
         <w:tc>
           <w:tcPr>
-            <w:tcW w:type="dxa" w:w="3135"/>
+            <w:tcW w:type="dxa" w:w="3211"/>
             <w:vAlign w:val="center"/>
           </w:tcPr>
           <w:p>
             <w:pPr>
-              <w:spacing w:after="0" w:line="264" w:lineRule="auto"/>
+              <w:spacing w:line="252" w:lineRule="auto"/>
             </w:pPr>
             <w:r/>
             <w:r>
               <w:rPr>
-                <w:rFonts w:ascii="仿宋_GB2312" w:hAnsi="仿宋_GB2312" w:eastAsia="仿宋_GB2312" w:cs="仿宋_GB2312"/>
+                <w:rFonts w:ascii="Noto Sans CJK SC" w:hAnsi="Noto Sans CJK SC" w:eastAsia="Noto Sans CJK SC" w:cs="Noto Sans CJK SC"/>
                 <w:b w:val="0"/>
                 <w:sz w:val="18"/>
               </w:rPr>
-              <w:t>P1 现场三问 + A/B身份</w:t>
+              <w:t>P1 开场：三个现场问题+A/B身份</w:t>
             </w:r>
           </w:p>
         </w:tc>
         <w:tc>
           <w:tcPr>
-            <w:tcW w:type="dxa" w:w="3135"/>
+            <w:tcW w:type="dxa" w:w="3211"/>
             <w:vAlign w:val="center"/>
           </w:tcPr>
           <w:p>
             <w:pPr>
-              <w:spacing w:after="0" w:line="264" w:lineRule="auto"/>
+              <w:spacing w:line="252" w:lineRule="auto"/>
             </w:pPr>
             <w:r/>
             <w:r>
               <w:rPr>
-                <w:rFonts w:ascii="仿宋_GB2312" w:hAnsi="仿宋_GB2312" w:eastAsia="仿宋_GB2312" w:cs="仿宋_GB2312"/>
+                <w:rFonts w:ascii="Noto Sans CJK SC" w:hAnsi="Noto Sans CJK SC" w:eastAsia="Noto Sans CJK SC" w:cs="Noto Sans CJK SC"/>
                 <w:b w:val="0"/>
                 <w:sz w:val="18"/>
               </w:rPr>
-              <w:t>先让评委知道“为什么要做”，不是先讲系统。</w:t>
+              <w:t>先知道谁在讲、为什么做</w:t>
             </w:r>
           </w:p>
         </w:tc>
@@ -226,61 +220,61 @@
       <w:tr>
         <w:tc>
           <w:tcPr>
-            <w:tcW w:type="dxa" w:w="3135"/>
+            <w:tcW w:type="dxa" w:w="3211"/>
             <w:vAlign w:val="center"/>
           </w:tcPr>
           <w:p>
             <w:pPr>
-              <w:spacing w:after="0" w:line="264" w:lineRule="auto"/>
+              <w:spacing w:line="252" w:lineRule="auto"/>
             </w:pPr>
             <w:r/>
             <w:r>
               <w:rPr>
-                <w:rFonts w:ascii="仿宋_GB2312" w:hAnsi="仿宋_GB2312" w:eastAsia="仿宋_GB2312" w:cs="仿宋_GB2312"/>
+                <w:rFonts w:ascii="Noto Sans CJK SC" w:hAnsi="Noto Sans CJK SC" w:eastAsia="Noto Sans CJK SC" w:cs="Noto Sans CJK SC"/>
                 <w:b w:val="0"/>
                 <w:sz w:val="18"/>
               </w:rPr>
-              <w:t>0:55-1:35</w:t>
+              <w:t>0:55–1:35</w:t>
             </w:r>
           </w:p>
         </w:tc>
         <w:tc>
           <w:tcPr>
-            <w:tcW w:type="dxa" w:w="3135"/>
+            <w:tcW w:type="dxa" w:w="3211"/>
             <w:vAlign w:val="center"/>
           </w:tcPr>
           <w:p>
             <w:pPr>
-              <w:spacing w:after="0" w:line="264" w:lineRule="auto"/>
+              <w:spacing w:line="252" w:lineRule="auto"/>
             </w:pPr>
             <w:r/>
             <w:r>
               <w:rPr>
-                <w:rFonts w:ascii="仿宋_GB2312" w:hAnsi="仿宋_GB2312" w:eastAsia="仿宋_GB2312" w:cs="仿宋_GB2312"/>
+                <w:rFonts w:ascii="Noto Sans CJK SC" w:hAnsi="Noto Sans CJK SC" w:eastAsia="Noto Sans CJK SC" w:cs="Noto Sans CJK SC"/>
                 <w:b w:val="0"/>
                 <w:sz w:val="18"/>
               </w:rPr>
-              <w:t>P2 三类主体“三愁” + 三大痛点</w:t>
+              <w:t>P2 三类主体“三愁”+三大痛点</w:t>
             </w:r>
           </w:p>
         </w:tc>
         <w:tc>
           <w:tcPr>
-            <w:tcW w:type="dxa" w:w="3135"/>
+            <w:tcW w:type="dxa" w:w="3211"/>
             <w:vAlign w:val="center"/>
           </w:tcPr>
           <w:p>
             <w:pPr>
-              <w:spacing w:after="0" w:line="264" w:lineRule="auto"/>
+              <w:spacing w:line="252" w:lineRule="auto"/>
             </w:pPr>
             <w:r/>
             <w:r>
               <w:rPr>
-                <w:rFonts w:ascii="仿宋_GB2312" w:hAnsi="仿宋_GB2312" w:eastAsia="仿宋_GB2312" w:cs="仿宋_GB2312"/>
+                <w:rFonts w:ascii="Noto Sans CJK SC" w:hAnsi="Noto Sans CJK SC" w:eastAsia="Noto Sans CJK SC" w:cs="Noto Sans CJK SC"/>
                 <w:b w:val="0"/>
                 <w:sz w:val="18"/>
               </w:rPr>
-              <w:t>从表象上升到资源调度、投入决策、管护闭环三个根因。</w:t>
+              <w:t>从表象升到根因</w:t>
             </w:r>
           </w:p>
         </w:tc>
@@ -288,61 +282,61 @@
       <w:tr>
         <w:tc>
           <w:tcPr>
-            <w:tcW w:type="dxa" w:w="3135"/>
+            <w:tcW w:type="dxa" w:w="3211"/>
             <w:vAlign w:val="center"/>
           </w:tcPr>
           <w:p>
             <w:pPr>
-              <w:spacing w:after="0" w:line="264" w:lineRule="auto"/>
+              <w:spacing w:line="252" w:lineRule="auto"/>
             </w:pPr>
             <w:r/>
             <w:r>
               <w:rPr>
-                <w:rFonts w:ascii="仿宋_GB2312" w:hAnsi="仿宋_GB2312" w:eastAsia="仿宋_GB2312" w:cs="仿宋_GB2312"/>
+                <w:rFonts w:ascii="Noto Sans CJK SC" w:hAnsi="Noto Sans CJK SC" w:eastAsia="Noto Sans CJK SC" w:cs="Noto Sans CJK SC"/>
                 <w:b w:val="0"/>
                 <w:sz w:val="18"/>
               </w:rPr>
-              <w:t>1:35-1:55</w:t>
+              <w:t>1:35–1:55</w:t>
             </w:r>
           </w:p>
         </w:tc>
         <w:tc>
           <w:tcPr>
-            <w:tcW w:type="dxa" w:w="3135"/>
+            <w:tcW w:type="dxa" w:w="3211"/>
             <w:vAlign w:val="center"/>
           </w:tcPr>
           <w:p>
             <w:pPr>
-              <w:spacing w:after="0" w:line="264" w:lineRule="auto"/>
+              <w:spacing w:line="252" w:lineRule="auto"/>
             </w:pPr>
             <w:r/>
             <w:r>
               <w:rPr>
-                <w:rFonts w:ascii="仿宋_GB2312" w:hAnsi="仿宋_GB2312" w:eastAsia="仿宋_GB2312" w:cs="仿宋_GB2312"/>
+                <w:rFonts w:ascii="Noto Sans CJK SC" w:hAnsi="Noto Sans CJK SC" w:eastAsia="Noto Sans CJK SC" w:cs="Noto Sans CJK SC"/>
                 <w:b w:val="0"/>
                 <w:sz w:val="18"/>
               </w:rPr>
-              <w:t>P3 1234总体架构</w:t>
+              <w:t>P3 “1234”总体架构</w:t>
             </w:r>
           </w:p>
         </w:tc>
         <w:tc>
           <w:tcPr>
-            <w:tcW w:type="dxa" w:w="3135"/>
+            <w:tcW w:type="dxa" w:w="3211"/>
             <w:vAlign w:val="center"/>
           </w:tcPr>
           <w:p>
             <w:pPr>
-              <w:spacing w:after="0" w:line="264" w:lineRule="auto"/>
+              <w:spacing w:line="252" w:lineRule="auto"/>
             </w:pPr>
             <w:r/>
             <w:r>
               <w:rPr>
-                <w:rFonts w:ascii="仿宋_GB2312" w:hAnsi="仿宋_GB2312" w:eastAsia="仿宋_GB2312" w:cs="仿宋_GB2312"/>
+                <w:rFonts w:ascii="Noto Sans CJK SC" w:hAnsi="Noto Sans CJK SC" w:eastAsia="Noto Sans CJK SC" w:cs="Noto Sans CJK SC"/>
                 <w:b w:val="0"/>
                 <w:sz w:val="18"/>
               </w:rPr>
-              <w:t>一库清底、双模决策、三智协同、四队长效。</w:t>
+              <w:t>一库清底、双模决策、三智协同、四队长效</w:t>
             </w:r>
           </w:p>
         </w:tc>
@@ -350,37 +344,37 @@
       <w:tr>
         <w:tc>
           <w:tcPr>
-            <w:tcW w:type="dxa" w:w="3135"/>
+            <w:tcW w:type="dxa" w:w="3211"/>
             <w:vAlign w:val="center"/>
           </w:tcPr>
           <w:p>
             <w:pPr>
-              <w:spacing w:after="0" w:line="264" w:lineRule="auto"/>
+              <w:spacing w:line="252" w:lineRule="auto"/>
             </w:pPr>
             <w:r/>
             <w:r>
               <w:rPr>
-                <w:rFonts w:ascii="仿宋_GB2312" w:hAnsi="仿宋_GB2312" w:eastAsia="仿宋_GB2312" w:cs="仿宋_GB2312"/>
+                <w:rFonts w:ascii="Noto Sans CJK SC" w:hAnsi="Noto Sans CJK SC" w:eastAsia="Noto Sans CJK SC" w:cs="Noto Sans CJK SC"/>
                 <w:b w:val="0"/>
                 <w:sz w:val="18"/>
               </w:rPr>
-              <w:t>1:55-3:25</w:t>
+              <w:t>1:55–3:25</w:t>
             </w:r>
           </w:p>
         </w:tc>
         <w:tc>
           <w:tcPr>
-            <w:tcW w:type="dxa" w:w="3135"/>
+            <w:tcW w:type="dxa" w:w="3211"/>
             <w:vAlign w:val="center"/>
           </w:tcPr>
           <w:p>
             <w:pPr>
-              <w:spacing w:after="0" w:line="264" w:lineRule="auto"/>
+              <w:spacing w:line="252" w:lineRule="auto"/>
             </w:pPr>
             <w:r/>
             <w:r>
               <w:rPr>
-                <w:rFonts w:ascii="仿宋_GB2312" w:hAnsi="仿宋_GB2312" w:eastAsia="仿宋_GB2312" w:cs="仿宋_GB2312"/>
+                <w:rFonts w:ascii="Noto Sans CJK SC" w:hAnsi="Noto Sans CJK SC" w:eastAsia="Noto Sans CJK SC" w:cs="Noto Sans CJK SC"/>
                 <w:b w:val="0"/>
                 <w:sz w:val="18"/>
               </w:rPr>
@@ -390,21 +384,21 @@
         </w:tc>
         <w:tc>
           <w:tcPr>
-            <w:tcW w:type="dxa" w:w="3135"/>
+            <w:tcW w:type="dxa" w:w="3211"/>
             <w:vAlign w:val="center"/>
           </w:tcPr>
           <w:p>
             <w:pPr>
-              <w:spacing w:after="0" w:line="264" w:lineRule="auto"/>
+              <w:spacing w:line="252" w:lineRule="auto"/>
             </w:pPr>
             <w:r/>
             <w:r>
               <w:rPr>
-                <w:rFonts w:ascii="仿宋_GB2312" w:hAnsi="仿宋_GB2312" w:eastAsia="仿宋_GB2312" w:cs="仿宋_GB2312"/>
+                <w:rFonts w:ascii="Noto Sans CJK SC" w:hAnsi="Noto Sans CJK SC" w:eastAsia="Noto Sans CJK SC" w:cs="Noto Sans CJK SC"/>
                 <w:b w:val="0"/>
                 <w:sz w:val="18"/>
               </w:rPr>
-              <w:t>输入→健康分→寿命→预警→维修动作；突出“能续命、不能回春”。</w:t>
+              <w:t>输入→评分→寿命→预警→维修动作</w:t>
             </w:r>
           </w:p>
         </w:tc>
@@ -412,37 +406,37 @@
       <w:tr>
         <w:tc>
           <w:tcPr>
-            <w:tcW w:type="dxa" w:w="3135"/>
+            <w:tcW w:type="dxa" w:w="3211"/>
             <w:vAlign w:val="center"/>
           </w:tcPr>
           <w:p>
             <w:pPr>
-              <w:spacing w:after="0" w:line="264" w:lineRule="auto"/>
+              <w:spacing w:line="252" w:lineRule="auto"/>
             </w:pPr>
             <w:r/>
             <w:r>
               <w:rPr>
-                <w:rFonts w:ascii="仿宋_GB2312" w:hAnsi="仿宋_GB2312" w:eastAsia="仿宋_GB2312" w:cs="仿宋_GB2312"/>
+                <w:rFonts w:ascii="Noto Sans CJK SC" w:hAnsi="Noto Sans CJK SC" w:eastAsia="Noto Sans CJK SC" w:cs="Noto Sans CJK SC"/>
                 <w:b w:val="0"/>
                 <w:sz w:val="18"/>
               </w:rPr>
-              <w:t>3:25-4:55</w:t>
+              <w:t>3:25–4:55</w:t>
             </w:r>
           </w:p>
         </w:tc>
         <w:tc>
           <w:tcPr>
-            <w:tcW w:type="dxa" w:w="3135"/>
+            <w:tcW w:type="dxa" w:w="3211"/>
             <w:vAlign w:val="center"/>
           </w:tcPr>
           <w:p>
             <w:pPr>
-              <w:spacing w:after="0" w:line="264" w:lineRule="auto"/>
+              <w:spacing w:line="252" w:lineRule="auto"/>
             </w:pPr>
             <w:r/>
             <w:r>
               <w:rPr>
-                <w:rFonts w:ascii="仿宋_GB2312" w:hAnsi="仿宋_GB2312" w:eastAsia="仿宋_GB2312" w:cs="仿宋_GB2312"/>
+                <w:rFonts w:ascii="Noto Sans CJK SC" w:hAnsi="Noto Sans CJK SC" w:eastAsia="Noto Sans CJK SC" w:cs="Noto Sans CJK SC"/>
                 <w:b w:val="0"/>
                 <w:sz w:val="18"/>
               </w:rPr>
@@ -452,21 +446,21 @@
         </w:tc>
         <w:tc>
           <w:tcPr>
-            <w:tcW w:type="dxa" w:w="3135"/>
+            <w:tcW w:type="dxa" w:w="3211"/>
             <w:vAlign w:val="center"/>
           </w:tcPr>
           <w:p>
             <w:pPr>
-              <w:spacing w:after="0" w:line="264" w:lineRule="auto"/>
+              <w:spacing w:line="252" w:lineRule="auto"/>
             </w:pPr>
             <w:r/>
             <w:r>
               <w:rPr>
-                <w:rFonts w:ascii="仿宋_GB2312" w:hAnsi="仿宋_GB2312" w:eastAsia="仿宋_GB2312" w:cs="仿宋_GB2312"/>
+                <w:rFonts w:ascii="Noto Sans CJK SC" w:hAnsi="Noto Sans CJK SC" w:eastAsia="Noto Sans CJK SC" w:cs="Noto Sans CJK SC"/>
                 <w:b w:val="0"/>
                 <w:sz w:val="18"/>
               </w:rPr>
-              <w:t>有效烤能→50/30/20指数→AHP/熵权→TOPSIS→2/5/10%情景。</w:t>
+              <w:t>有效烤能→50/30/20→AHP/熵权→TOPSIS→2/5/10%推演</w:t>
             </w:r>
           </w:p>
         </w:tc>
@@ -474,61 +468,61 @@
       <w:tr>
         <w:tc>
           <w:tcPr>
-            <w:tcW w:type="dxa" w:w="3135"/>
+            <w:tcW w:type="dxa" w:w="3211"/>
             <w:vAlign w:val="center"/>
           </w:tcPr>
           <w:p>
             <w:pPr>
-              <w:spacing w:after="0" w:line="264" w:lineRule="auto"/>
+              <w:spacing w:line="252" w:lineRule="auto"/>
             </w:pPr>
             <w:r/>
             <w:r>
               <w:rPr>
-                <w:rFonts w:ascii="仿宋_GB2312" w:hAnsi="仿宋_GB2312" w:eastAsia="仿宋_GB2312" w:cs="仿宋_GB2312"/>
+                <w:rFonts w:ascii="Noto Sans CJK SC" w:hAnsi="Noto Sans CJK SC" w:eastAsia="Noto Sans CJK SC" w:cs="Noto Sans CJK SC"/>
                 <w:b w:val="0"/>
                 <w:sz w:val="18"/>
               </w:rPr>
-              <w:t>4:55-5:30</w:t>
+              <w:t>4:55–5:30</w:t>
             </w:r>
           </w:p>
         </w:tc>
         <w:tc>
           <w:tcPr>
-            <w:tcW w:type="dxa" w:w="3135"/>
+            <w:tcW w:type="dxa" w:w="3211"/>
             <w:vAlign w:val="center"/>
           </w:tcPr>
           <w:p>
             <w:pPr>
-              <w:spacing w:after="0" w:line="264" w:lineRule="auto"/>
+              <w:spacing w:line="252" w:lineRule="auto"/>
             </w:pPr>
             <w:r/>
             <w:r>
               <w:rPr>
-                <w:rFonts w:ascii="仿宋_GB2312" w:hAnsi="仿宋_GB2312" w:eastAsia="仿宋_GB2312" w:cs="仿宋_GB2312"/>
+                <w:rFonts w:ascii="Noto Sans CJK SC" w:hAnsi="Noto Sans CJK SC" w:eastAsia="Noto Sans CJK SC" w:cs="Noto Sans CJK SC"/>
                 <w:b w:val="0"/>
                 <w:sz w:val="18"/>
               </w:rPr>
-              <w:t>P6 视频35秒</w:t>
+              <w:t>P6 35秒视频</w:t>
             </w:r>
           </w:p>
         </w:tc>
         <w:tc>
           <w:tcPr>
-            <w:tcW w:type="dxa" w:w="3135"/>
+            <w:tcW w:type="dxa" w:w="3211"/>
             <w:vAlign w:val="center"/>
           </w:tcPr>
           <w:p>
             <w:pPr>
-              <w:spacing w:after="0" w:line="264" w:lineRule="auto"/>
+              <w:spacing w:line="252" w:lineRule="auto"/>
             </w:pPr>
             <w:r/>
             <w:r>
               <w:rPr>
-                <w:rFonts w:ascii="仿宋_GB2312" w:hAnsi="仿宋_GB2312" w:eastAsia="仿宋_GB2312" w:cs="仿宋_GB2312"/>
+                <w:rFonts w:ascii="Noto Sans CJK SC" w:hAnsi="Noto Sans CJK SC" w:eastAsia="Noto Sans CJK SC" w:cs="Noto Sans CJK SC"/>
                 <w:b w:val="0"/>
                 <w:sz w:val="18"/>
               </w:rPr>
-              <w:t>只演决策链，不重复口播。</w:t>
+              <w:t>只演模型结果如何改变动作</w:t>
             </w:r>
           </w:p>
         </w:tc>
@@ -536,61 +530,61 @@
       <w:tr>
         <w:tc>
           <w:tcPr>
-            <w:tcW w:type="dxa" w:w="3135"/>
+            <w:tcW w:type="dxa" w:w="3211"/>
             <w:vAlign w:val="center"/>
           </w:tcPr>
           <w:p>
             <w:pPr>
-              <w:spacing w:after="0" w:line="264" w:lineRule="auto"/>
+              <w:spacing w:line="252" w:lineRule="auto"/>
             </w:pPr>
             <w:r/>
             <w:r>
               <w:rPr>
-                <w:rFonts w:ascii="仿宋_GB2312" w:hAnsi="仿宋_GB2312" w:eastAsia="仿宋_GB2312" w:cs="仿宋_GB2312"/>
+                <w:rFonts w:ascii="Noto Sans CJK SC" w:hAnsi="Noto Sans CJK SC" w:eastAsia="Noto Sans CJK SC" w:cs="Noto Sans CJK SC"/>
                 <w:b w:val="0"/>
                 <w:sz w:val="18"/>
               </w:rPr>
-              <w:t>5:30-6:55</w:t>
+              <w:t>5:30–6:55</w:t>
             </w:r>
           </w:p>
         </w:tc>
         <w:tc>
           <w:tcPr>
-            <w:tcW w:type="dxa" w:w="3135"/>
+            <w:tcW w:type="dxa" w:w="3211"/>
             <w:vAlign w:val="center"/>
           </w:tcPr>
           <w:p>
             <w:pPr>
-              <w:spacing w:after="0" w:line="264" w:lineRule="auto"/>
+              <w:spacing w:line="252" w:lineRule="auto"/>
             </w:pPr>
             <w:r/>
             <w:r>
               <w:rPr>
-                <w:rFonts w:ascii="仿宋_GB2312" w:hAnsi="仿宋_GB2312" w:eastAsia="仿宋_GB2312" w:cs="仿宋_GB2312"/>
+                <w:rFonts w:ascii="Noto Sans CJK SC" w:hAnsi="Noto Sans CJK SC" w:eastAsia="Noto Sans CJK SC" w:cs="Noto Sans CJK SC"/>
                 <w:b w:val="0"/>
                 <w:sz w:val="18"/>
               </w:rPr>
-              <w:t>P7 三智落地 + 磨坪案例 + 四组硬数据</w:t>
+              <w:t>P7 三智落地+磨坪案例+官方成效</w:t>
             </w:r>
           </w:p>
         </w:tc>
         <w:tc>
           <w:tcPr>
-            <w:tcW w:type="dxa" w:w="3135"/>
+            <w:tcW w:type="dxa" w:w="3211"/>
             <w:vAlign w:val="center"/>
           </w:tcPr>
           <w:p>
             <w:pPr>
-              <w:spacing w:after="0" w:line="264" w:lineRule="auto"/>
+              <w:spacing w:line="252" w:lineRule="auto"/>
             </w:pPr>
             <w:r/>
             <w:r>
               <w:rPr>
-                <w:rFonts w:ascii="仿宋_GB2312" w:hAnsi="仿宋_GB2312" w:eastAsia="仿宋_GB2312" w:cs="仿宋_GB2312"/>
+                <w:rFonts w:ascii="Noto Sans CJK SC" w:hAnsi="Noto Sans CJK SC" w:eastAsia="Noto Sans CJK SC" w:cs="Noto Sans CJK SC"/>
                 <w:b w:val="0"/>
                 <w:sz w:val="18"/>
               </w:rPr>
-              <w:t>用真实结果回答“模型有没有用”。</w:t>
+              <w:t>用真实结果回答模型有没有用</w:t>
             </w:r>
           </w:p>
         </w:tc>
@@ -598,61 +592,61 @@
       <w:tr>
         <w:tc>
           <w:tcPr>
-            <w:tcW w:type="dxa" w:w="3135"/>
+            <w:tcW w:type="dxa" w:w="3211"/>
             <w:vAlign w:val="center"/>
           </w:tcPr>
           <w:p>
             <w:pPr>
-              <w:spacing w:after="0" w:line="264" w:lineRule="auto"/>
+              <w:spacing w:line="252" w:lineRule="auto"/>
             </w:pPr>
             <w:r/>
             <w:r>
               <w:rPr>
-                <w:rFonts w:ascii="仿宋_GB2312" w:hAnsi="仿宋_GB2312" w:eastAsia="仿宋_GB2312" w:cs="仿宋_GB2312"/>
+                <w:rFonts w:ascii="Noto Sans CJK SC" w:hAnsi="Noto Sans CJK SC" w:eastAsia="Noto Sans CJK SC" w:cs="Noto Sans CJK SC"/>
                 <w:b w:val="0"/>
                 <w:sz w:val="18"/>
               </w:rPr>
-              <w:t>6:55-7:45</w:t>
+              <w:t>6:55–7:45</w:t>
             </w:r>
           </w:p>
         </w:tc>
         <w:tc>
           <w:tcPr>
-            <w:tcW w:type="dxa" w:w="3135"/>
+            <w:tcW w:type="dxa" w:w="3211"/>
             <w:vAlign w:val="center"/>
           </w:tcPr>
           <w:p>
             <w:pPr>
-              <w:spacing w:after="0" w:line="264" w:lineRule="auto"/>
+              <w:spacing w:line="252" w:lineRule="auto"/>
             </w:pPr>
             <w:r/>
             <w:r>
               <w:rPr>
-                <w:rFonts w:ascii="仿宋_GB2312" w:hAnsi="仿宋_GB2312" w:eastAsia="仿宋_GB2312" w:cs="仿宋_GB2312"/>
+                <w:rFonts w:ascii="Noto Sans CJK SC" w:hAnsi="Noto Sans CJK SC" w:eastAsia="Noto Sans CJK SC" w:cs="Noto Sans CJK SC"/>
                 <w:b w:val="0"/>
                 <w:sz w:val="18"/>
               </w:rPr>
-              <w:t>P8 创新总结 + 1234 + 三个“不是”</w:t>
+              <w:t>P8 创新总结+口诀</w:t>
             </w:r>
           </w:p>
         </w:tc>
         <w:tc>
           <w:tcPr>
-            <w:tcW w:type="dxa" w:w="3135"/>
+            <w:tcW w:type="dxa" w:w="3211"/>
             <w:vAlign w:val="center"/>
           </w:tcPr>
           <w:p>
             <w:pPr>
-              <w:spacing w:after="0" w:line="264" w:lineRule="auto"/>
+              <w:spacing w:line="252" w:lineRule="auto"/>
             </w:pPr>
             <w:r/>
             <w:r>
               <w:rPr>
-                <w:rFonts w:ascii="仿宋_GB2312" w:hAnsi="仿宋_GB2312" w:eastAsia="仿宋_GB2312" w:cs="仿宋_GB2312"/>
+                <w:rFonts w:ascii="Noto Sans CJK SC" w:hAnsi="Noto Sans CJK SC" w:eastAsia="Noto Sans CJK SC" w:cs="Noto Sans CJK SC"/>
                 <w:b w:val="0"/>
                 <w:sz w:val="18"/>
               </w:rPr>
-              <w:t>形成评委可复述的记忆点，留15秒机动。</w:t>
+              <w:t>双模耦合、动态推演、长效闭环；留15秒机动</w:t>
             </w:r>
           </w:p>
         </w:tc>
@@ -661,793 +655,353 @@
     <w:p>
       <w:pPr>
         <w:pStyle w:val="Heading1"/>
-        <w:spacing w:before="180" w:after="80"/>
-      </w:pPr>
-      <w:r>
-        <w:t>二、正式双人发布稿（现场直接使用）</w:t>
-      </w:r>
-    </w:p>
-    <w:p>
-      <w:pPr>
-        <w:spacing w:line="341" w:lineRule="auto" w:after="40"/>
+        <w:spacing w:before="160" w:after="80"/>
       </w:pPr>
       <w:r>
         <w:rPr>
           <w:rFonts w:ascii="黑体" w:hAnsi="黑体" w:eastAsia="黑体" w:cs="黑体"/>
           <w:b/>
-          <w:sz w:val="32"/>
+          <w:sz w:val="36"/>
+        </w:rPr>
+        <w:t>二、双人正式发布稿（可直接排练）</w:t>
+      </w:r>
+    </w:p>
+    <w:p>
+      <w:pPr>
+        <w:spacing w:line="324" w:lineRule="auto"/>
+      </w:pPr>
+      <w:r>
+        <w:rPr>
+          <w:rFonts w:ascii="黑体" w:hAnsi="黑体" w:eastAsia="黑体" w:cs="黑体"/>
+          <w:b/>
+          <w:sz w:val="30"/>
         </w:rPr>
         <w:t>A：</w:t>
       </w:r>
       <w:r>
         <w:rPr>
           <w:rFonts w:ascii="仿宋_GB2312" w:hAnsi="仿宋_GB2312" w:eastAsia="仿宋_GB2312" w:cs="仿宋_GB2312"/>
-          <w:sz w:val="32"/>
+          <w:sz w:val="30"/>
         </w:rPr>
-        <w:t>尊敬的各位领导、各位评委，大家好！我是宜昌市局“智同道合”创客小组余文杰。</w:t>
+        <w:t>尊敬的各位领导、各位专家评委，大家好！我是宜昌市局“智同道合”创客小组的余文杰。</w:t>
       </w:r>
     </w:p>
     <w:p>
       <w:pPr>
-        <w:spacing w:line="341" w:lineRule="auto" w:after="40"/>
+        <w:spacing w:line="324" w:lineRule="auto"/>
       </w:pPr>
       <w:r>
         <w:rPr>
           <w:rFonts w:ascii="黑体" w:hAnsi="黑体" w:eastAsia="黑体" w:cs="黑体"/>
           <w:b/>
-          <w:sz w:val="32"/>
+          <w:sz w:val="30"/>
         </w:rPr>
         <w:t>B：</w:t>
       </w:r>
       <w:r>
         <w:rPr>
           <w:rFonts w:ascii="仿宋_GB2312" w:hAnsi="仿宋_GB2312" w:eastAsia="仿宋_GB2312" w:cs="仿宋_GB2312"/>
-          <w:sz w:val="32"/>
+          <w:sz w:val="30"/>
         </w:rPr>
-        <w:t>大家好！我是项目组的另一位讲解员。今天我就当一次“烤房管家”，替烟农、烟站和合作社，问三个最现实的问题：旺季没房怎么办？烤到一半坏了谁来修？钱有限，到底该修旧房，还是建新房？</w:t>
+        <w:t>大家好，我是项目组成员胡浩博。今天我们不先讲系统，先听三句话：旺季烤房没空，借不到；烤到一半设备坏了，修不及；到了年底，究竟先修哪栋、哪里还该新建，说不清。</w:t>
       </w:r>
     </w:p>
     <w:p>
       <w:pPr>
-        <w:spacing w:line="341" w:lineRule="auto" w:after="40"/>
+        <w:spacing w:line="324" w:lineRule="auto"/>
       </w:pPr>
       <w:r>
         <w:rPr>
           <w:rFonts w:ascii="黑体" w:hAnsi="黑体" w:eastAsia="黑体" w:cs="黑体"/>
           <w:b/>
-          <w:sz w:val="32"/>
+          <w:sz w:val="30"/>
         </w:rPr>
         <w:t>A：</w:t>
       </w:r>
       <w:r>
         <w:rPr>
           <w:rFonts w:ascii="仿宋_GB2312" w:hAnsi="仿宋_GB2312" w:eastAsia="仿宋_GB2312" w:cs="仿宋_GB2312"/>
-          <w:sz w:val="32"/>
+          <w:sz w:val="30"/>
         </w:rPr>
-        <w:t>这三个问题，正是我们项目的起点。</w:t>
+        <w:t>2025年，我们面向烟农开展问卷和一线走访，累计回收700余份问卷，其中531份有效样本进入统计。表面看，是烟农“用房愁、抢修愁”；往深处看，还有烟站“底数不清、投入无据”，合作社“责任难落、管护难长效”。这不是三个孤立问题，而是烤房从使用、投入到管护的一条链没有真正贯通。我们把它归纳为三大痛点：资源调度缺少数字支撑，基础设施投入缺少量化依据，管护运维缺少闭环工具。</w:t>
       </w:r>
     </w:p>
     <w:p>
       <w:pPr>
-        <w:spacing w:line="341" w:lineRule="auto" w:after="40"/>
+        <w:spacing w:line="324" w:lineRule="auto"/>
       </w:pPr>
       <w:r>
         <w:rPr>
           <w:rFonts w:ascii="黑体" w:hAnsi="黑体" w:eastAsia="黑体" w:cs="黑体"/>
           <w:b/>
-          <w:sz w:val="32"/>
+          <w:sz w:val="30"/>
+        </w:rPr>
+        <w:t>A：</w:t>
+      </w:r>
+      <w:r>
+        <w:rPr>
+          <w:rFonts w:ascii="仿宋_GB2312" w:hAnsi="仿宋_GB2312" w:eastAsia="仿宋_GB2312" w:cs="仿宋_GB2312"/>
+          <w:sz w:val="30"/>
+        </w:rPr>
+        <w:t>为此，我们打造“智烤管家——基于健康评估的烤房用投管一体化解决方案”。为了让大家记得住，我们把路径概括成“1234”：一库清底、双模决策、三智协同、四队长效。底层仍然是一个数据库、两个模型、一个协同平台。</w:t>
+      </w:r>
+    </w:p>
+    <w:p>
+      <w:pPr>
+        <w:spacing w:line="324" w:lineRule="auto"/>
+      </w:pPr>
+      <w:r>
+        <w:rPr>
+          <w:rFonts w:ascii="黑体" w:hAnsi="黑体" w:eastAsia="黑体" w:cs="黑体"/>
+          <w:b/>
+          <w:sz w:val="30"/>
         </w:rPr>
         <w:t>B：</w:t>
       </w:r>
       <w:r>
         <w:rPr>
           <w:rFonts w:ascii="仿宋_GB2312" w:hAnsi="仿宋_GB2312" w:eastAsia="仿宋_GB2312" w:cs="仿宋_GB2312"/>
-          <w:b w:val="0"/>
-          <w:sz w:val="32"/>
+          <w:sz w:val="30"/>
         </w:rPr>
-        <w:t>2025年，我们通过烟农问卷和一线走访发现，烤房管理表面上是“用房难、抢修慢、投入难”，背后却是</w:t>
-      </w:r>
-      <w:r>
-        <w:rPr>
-          <w:rFonts w:ascii="仿宋_GB2312" w:hAnsi="仿宋_GB2312" w:eastAsia="仿宋_GB2312" w:cs="仿宋_GB2312"/>
-          <w:b/>
-          <w:sz w:val="32"/>
-        </w:rPr>
-        <w:t>三类主体的“三愁”</w:t>
-      </w:r>
-      <w:r>
-        <w:rPr>
-          <w:rFonts w:ascii="仿宋_GB2312" w:hAnsi="仿宋_GB2312" w:eastAsia="仿宋_GB2312" w:cs="仿宋_GB2312"/>
-          <w:b w:val="0"/>
-          <w:sz w:val="32"/>
-        </w:rPr>
-        <w:t>：烟农愁资源分布不均、临时调剂无门；烟站愁底数不清、状态不明，新建修复缺少量化依据；合作社愁责任悬空、队伍不稳、资金和流程难规范。</w:t>
+        <w:t>先说“一库”。没有可信的数据，再聪明的模型也是空中楼阁。</w:t>
       </w:r>
     </w:p>
     <w:p>
       <w:pPr>
-        <w:spacing w:line="341" w:lineRule="auto" w:after="40"/>
+        <w:spacing w:line="324" w:lineRule="auto"/>
       </w:pPr>
       <w:r>
         <w:rPr>
           <w:rFonts w:ascii="黑体" w:hAnsi="黑体" w:eastAsia="黑体" w:cs="黑体"/>
           <w:b/>
-          <w:sz w:val="32"/>
+          <w:sz w:val="30"/>
+        </w:rPr>
+        <w:t>B：</w:t>
+      </w:r>
+      <w:r>
+        <w:rPr>
+          <w:rFonts w:ascii="仿宋_GB2312" w:hAnsi="仿宋_GB2312" w:eastAsia="仿宋_GB2312" w:cs="仿宋_GB2312"/>
+          <w:sz w:val="30"/>
+        </w:rPr>
+        <w:t>我们以统一烤房编号为主线，把建设年份、使用状态、维修养护、烟农评价等数据归集起来；档案覆盖加热、散热、自控、主体等部位，模型重点抓取12个关键部件。2026年，秭归2442座烤房完成全口径入库，每栋烤房都有一份可追溯、可更新的数字档案。</w:t>
+      </w:r>
+    </w:p>
+    <w:p>
+      <w:pPr>
+        <w:spacing w:line="324" w:lineRule="auto"/>
+      </w:pPr>
+      <w:r>
+        <w:rPr>
+          <w:rFonts w:ascii="黑体" w:hAnsi="黑体" w:eastAsia="黑体" w:cs="黑体"/>
+          <w:b/>
+          <w:sz w:val="30"/>
+        </w:rPr>
+        <w:t>B：</w:t>
+      </w:r>
+      <w:r>
+        <w:rPr>
+          <w:rFonts w:ascii="仿宋_GB2312" w:hAnsi="仿宋_GB2312" w:eastAsia="仿宋_GB2312" w:cs="仿宋_GB2312"/>
+          <w:sz w:val="30"/>
+        </w:rPr>
+        <w:t>家底清楚了，2442栋里到底先修谁？这就到了第一颗“决策大脑”。</w:t>
+      </w:r>
+    </w:p>
+    <w:p>
+      <w:pPr>
+        <w:spacing w:line="324" w:lineRule="auto"/>
+      </w:pPr>
+      <w:r>
+        <w:rPr>
+          <w:rFonts w:ascii="黑体" w:hAnsi="黑体" w:eastAsia="黑体" w:cs="黑体"/>
+          <w:b/>
+          <w:sz w:val="30"/>
         </w:rPr>
         <w:t>A：</w:t>
       </w:r>
       <w:r>
         <w:rPr>
           <w:rFonts w:ascii="仿宋_GB2312" w:hAnsi="仿宋_GB2312" w:eastAsia="仿宋_GB2312" w:cs="仿宋_GB2312"/>
-          <w:b w:val="0"/>
-          <w:sz w:val="32"/>
+          <w:sz w:val="30"/>
         </w:rPr>
-        <w:t>我们把它归纳为三大痛点：</w:t>
-      </w:r>
-      <w:r>
-        <w:rPr>
-          <w:rFonts w:ascii="仿宋_GB2312" w:hAnsi="仿宋_GB2312" w:eastAsia="仿宋_GB2312" w:cs="仿宋_GB2312"/>
-          <w:b/>
-          <w:sz w:val="32"/>
-        </w:rPr>
-        <w:t>资源调度缺少数字支撑</w:t>
-      </w:r>
-      <w:r>
-        <w:rPr>
-          <w:rFonts w:ascii="仿宋_GB2312" w:hAnsi="仿宋_GB2312" w:eastAsia="仿宋_GB2312" w:cs="仿宋_GB2312"/>
-          <w:b w:val="0"/>
-          <w:sz w:val="32"/>
-        </w:rPr>
-        <w:t>，</w:t>
-      </w:r>
-      <w:r>
-        <w:rPr>
-          <w:rFonts w:ascii="仿宋_GB2312" w:hAnsi="仿宋_GB2312" w:eastAsia="仿宋_GB2312" w:cs="仿宋_GB2312"/>
-          <w:b/>
-          <w:sz w:val="32"/>
-        </w:rPr>
-        <w:t>基础设施投入缺少量化依据</w:t>
-      </w:r>
-      <w:r>
-        <w:rPr>
-          <w:rFonts w:ascii="仿宋_GB2312" w:hAnsi="仿宋_GB2312" w:eastAsia="仿宋_GB2312" w:cs="仿宋_GB2312"/>
-          <w:b w:val="0"/>
-          <w:sz w:val="32"/>
-        </w:rPr>
-        <w:t>，</w:t>
-      </w:r>
-      <w:r>
-        <w:rPr>
-          <w:rFonts w:ascii="仿宋_GB2312" w:hAnsi="仿宋_GB2312" w:eastAsia="仿宋_GB2312" w:cs="仿宋_GB2312"/>
-          <w:b/>
-          <w:sz w:val="32"/>
-        </w:rPr>
-        <w:t>管护运维缺少闭环工具</w:t>
-      </w:r>
-      <w:r>
-        <w:rPr>
-          <w:rFonts w:ascii="仿宋_GB2312" w:hAnsi="仿宋_GB2312" w:eastAsia="仿宋_GB2312" w:cs="仿宋_GB2312"/>
-          <w:b w:val="0"/>
-          <w:sz w:val="32"/>
-        </w:rPr>
-        <w:t>。再往深处看，根子只有一个——烤房的“用、投、管”彼此割裂：调度靠人问，投入靠经验，管护靠临时。为此，我们打造“智烤管家——基于健康评估的烤房用投管一体化解决方案”，形成一套“</w:t>
-      </w:r>
-      <w:r>
-        <w:rPr>
-          <w:rFonts w:ascii="仿宋_GB2312" w:hAnsi="仿宋_GB2312" w:eastAsia="仿宋_GB2312" w:cs="仿宋_GB2312"/>
-          <w:b/>
-          <w:sz w:val="32"/>
-        </w:rPr>
-        <w:t>1234</w:t>
-      </w:r>
-      <w:r>
-        <w:rPr>
-          <w:rFonts w:ascii="仿宋_GB2312" w:hAnsi="仿宋_GB2312" w:eastAsia="仿宋_GB2312" w:cs="仿宋_GB2312"/>
-          <w:b w:val="0"/>
-          <w:sz w:val="32"/>
-        </w:rPr>
-        <w:t>”路径：</w:t>
-      </w:r>
-      <w:r>
-        <w:rPr>
-          <w:rFonts w:ascii="仿宋_GB2312" w:hAnsi="仿宋_GB2312" w:eastAsia="仿宋_GB2312" w:cs="仿宋_GB2312"/>
-          <w:b/>
-          <w:sz w:val="32"/>
-        </w:rPr>
-        <w:t>一库清家底、双模做决策、三智跑业务、四队保长效</w:t>
-      </w:r>
-      <w:r>
-        <w:rPr>
-          <w:rFonts w:ascii="仿宋_GB2312" w:hAnsi="仿宋_GB2312" w:eastAsia="仿宋_GB2312" w:cs="仿宋_GB2312"/>
-          <w:b w:val="0"/>
-          <w:sz w:val="32"/>
-        </w:rPr>
-        <w:t>。真正的技术核心，是中间两大模型。</w:t>
+        <w:t>第一，是烤房健康评估模型。它不是简单打一个分，而是回答三件事：现在健不健康、还能稳定用多久、最先该修哪里。我们先把部件状态、剩余寿命占比和现场评价量化，再按重要度汇总；整栋健康分由部件健康80%、管护10%、人工评价10%构成。权重不是拍脑袋，我们用AHP把专家经验量化并做一致性校验，让每一分都可解释、可复核。</w:t>
       </w:r>
     </w:p>
     <w:p>
       <w:pPr>
-        <w:spacing w:line="341" w:lineRule="auto" w:after="40"/>
+        <w:spacing w:line="324" w:lineRule="auto"/>
       </w:pPr>
       <w:r>
         <w:rPr>
           <w:rFonts w:ascii="黑体" w:hAnsi="黑体" w:eastAsia="黑体" w:cs="黑体"/>
           <w:b/>
-          <w:sz w:val="32"/>
+          <w:sz w:val="30"/>
+        </w:rPr>
+        <w:t>A：</w:t>
+      </w:r>
+      <w:r>
+        <w:rPr>
+          <w:rFonts w:ascii="仿宋_GB2312" w:hAnsi="仿宋_GB2312" w:eastAsia="仿宋_GB2312" w:cs="仿宋_GB2312"/>
+          <w:sz w:val="30"/>
+        </w:rPr>
+        <w:t>只算健康分还不够。寿命预测再往前走一步：用威布尔分布描述部件寿命规律，结构件最短寿命形成“硬上限”，功能件寿命按重要度加权，再叠加维修次数折损、健康水平校准和房龄收缩，最终输出剩余年限、四级预警和风险部件排序。我们把这套逻辑概括成一句话：维修可以续命，但不能回春。换了一个新自控仪，不会让十几年的老烤房突然变成年轻烤房。</w:t>
+      </w:r>
+    </w:p>
+    <w:p>
+      <w:pPr>
+        <w:spacing w:line="324" w:lineRule="auto"/>
+      </w:pPr>
+      <w:r>
+        <w:rPr>
+          <w:rFonts w:ascii="黑体" w:hAnsi="黑体" w:eastAsia="黑体" w:cs="黑体"/>
+          <w:b/>
+          <w:sz w:val="30"/>
         </w:rPr>
         <w:t>B：</w:t>
       </w:r>
       <w:r>
         <w:rPr>
           <w:rFonts w:ascii="仿宋_GB2312" w:hAnsi="仿宋_GB2312" w:eastAsia="仿宋_GB2312" w:cs="仿宋_GB2312"/>
-          <w:sz w:val="32"/>
+          <w:sz w:val="30"/>
         </w:rPr>
-        <w:t>第一问：2442栋烤房，哪栋还能放心用？哪栋该先修？</w:t>
+        <w:t>这样一来，维修清单就从“谁先报谁先修”，变成“谁风险高、谁寿命短、谁影响大谁先修”。</w:t>
       </w:r>
     </w:p>
     <w:p>
       <w:pPr>
-        <w:spacing w:line="341" w:lineRule="auto" w:after="40"/>
+        <w:spacing w:line="324" w:lineRule="auto"/>
       </w:pPr>
       <w:r>
         <w:rPr>
           <w:rFonts w:ascii="黑体" w:hAnsi="黑体" w:eastAsia="黑体" w:cs="黑体"/>
           <w:b/>
-          <w:sz w:val="32"/>
+          <w:sz w:val="30"/>
         </w:rPr>
         <w:t>A：</w:t>
       </w:r>
       <w:r>
         <w:rPr>
           <w:rFonts w:ascii="仿宋_GB2312" w:hAnsi="仿宋_GB2312" w:eastAsia="仿宋_GB2312" w:cs="仿宋_GB2312"/>
-          <w:b w:val="0"/>
-          <w:sz w:val="32"/>
+          <w:sz w:val="30"/>
         </w:rPr>
-        <w:t>我们先给每栋烤房建立“一栋一档”，把</w:t>
-      </w:r>
-      <w:r>
-        <w:rPr>
-          <w:rFonts w:ascii="仿宋_GB2312" w:hAnsi="仿宋_GB2312" w:eastAsia="仿宋_GB2312" w:cs="仿宋_GB2312"/>
-          <w:b/>
-          <w:sz w:val="32"/>
-        </w:rPr>
-        <w:t>4大部位、12个关键部件</w:t>
-      </w:r>
-      <w:r>
-        <w:rPr>
-          <w:rFonts w:ascii="仿宋_GB2312" w:hAnsi="仿宋_GB2312" w:eastAsia="仿宋_GB2312" w:cs="仿宋_GB2312"/>
-          <w:b w:val="0"/>
-          <w:sz w:val="32"/>
-        </w:rPr>
-        <w:t>的状态、维修时间、指导寿命，与建成年份、管护方式、人工评价统一关联。健康评估不是凭感觉打分，而是分两步算：先把每个部件按“当前状态、剩余寿命占比、现场评价”三维量化，再按重要度汇总；然后按“</w:t>
-      </w:r>
-      <w:r>
-        <w:rPr>
-          <w:rFonts w:ascii="仿宋_GB2312" w:hAnsi="仿宋_GB2312" w:eastAsia="仿宋_GB2312" w:cs="仿宋_GB2312"/>
-          <w:b/>
-          <w:sz w:val="32"/>
-        </w:rPr>
-        <w:t>部件健康80%、管护10%、人工评价10%</w:t>
-      </w:r>
-      <w:r>
-        <w:rPr>
-          <w:rFonts w:ascii="仿宋_GB2312" w:hAnsi="仿宋_GB2312" w:eastAsia="仿宋_GB2312" w:cs="仿宋_GB2312"/>
-          <w:b w:val="0"/>
-          <w:sz w:val="32"/>
-        </w:rPr>
-        <w:t>”形成整栋健康分。权重由</w:t>
-      </w:r>
-      <w:r>
-        <w:rPr>
-          <w:rFonts w:ascii="仿宋_GB2312" w:hAnsi="仿宋_GB2312" w:eastAsia="仿宋_GB2312" w:cs="仿宋_GB2312"/>
-          <w:b/>
-          <w:sz w:val="32"/>
-        </w:rPr>
-        <w:t>AHP</w:t>
-      </w:r>
-      <w:r>
-        <w:rPr>
-          <w:rFonts w:ascii="仿宋_GB2312" w:hAnsi="仿宋_GB2312" w:eastAsia="仿宋_GB2312" w:cs="仿宋_GB2312"/>
-          <w:b w:val="0"/>
-          <w:sz w:val="32"/>
-        </w:rPr>
-        <w:t>把专家判断量化并进行一致性校验，让经验有尺度、结果可复核。</w:t>
+        <w:t>没错。最新成果口径中，2442栋烤房全部完成健康评价，筛出340多栋健康分低于60分的预警或危险烤房，为年度修复和资金安排提供了量化依据。</w:t>
       </w:r>
     </w:p>
     <w:p>
       <w:pPr>
-        <w:spacing w:line="341" w:lineRule="auto" w:after="40"/>
+        <w:spacing w:line="324" w:lineRule="auto"/>
       </w:pPr>
       <w:r>
         <w:rPr>
           <w:rFonts w:ascii="黑体" w:hAnsi="黑体" w:eastAsia="黑体" w:cs="黑体"/>
           <w:b/>
-          <w:sz w:val="32"/>
+          <w:sz w:val="30"/>
         </w:rPr>
         <w:t>B：</w:t>
       </w:r>
       <w:r>
         <w:rPr>
           <w:rFonts w:ascii="仿宋_GB2312" w:hAnsi="仿宋_GB2312" w:eastAsia="仿宋_GB2312" w:cs="仿宋_GB2312"/>
-          <w:sz w:val="32"/>
+          <w:sz w:val="30"/>
         </w:rPr>
-        <w:t>可光知道“多少分”还不够。评委更关心：这栋房还能用几年？什么时候必须修？</w:t>
+        <w:t>可如果旧房都盘活、该修的也修了，这个村还是缺烤能呢？</w:t>
       </w:r>
     </w:p>
     <w:p>
       <w:pPr>
-        <w:spacing w:line="341" w:lineRule="auto" w:after="40"/>
+        <w:spacing w:line="324" w:lineRule="auto"/>
       </w:pPr>
       <w:r>
         <w:rPr>
           <w:rFonts w:ascii="黑体" w:hAnsi="黑体" w:eastAsia="黑体" w:cs="黑体"/>
           <w:b/>
-          <w:sz w:val="32"/>
+          <w:sz w:val="30"/>
         </w:rPr>
         <w:t>A：</w:t>
       </w:r>
       <w:r>
         <w:rPr>
           <w:rFonts w:ascii="仿宋_GB2312" w:hAnsi="仿宋_GB2312" w:eastAsia="仿宋_GB2312" w:cs="仿宋_GB2312"/>
-          <w:b w:val="0"/>
-          <w:sz w:val="32"/>
+          <w:sz w:val="30"/>
         </w:rPr>
-        <w:t>所以我们把部件分成结构件和功能件：屋顶、墙体、大门、梁柱等结构件的最短寿命构成硬上限，功能件按重要度计算综合寿命，再叠加维修次数折损、健康水平校准和房龄收缩，并用</w:t>
-      </w:r>
-      <w:r>
-        <w:rPr>
-          <w:rFonts w:ascii="仿宋_GB2312" w:hAnsi="仿宋_GB2312" w:eastAsia="仿宋_GB2312" w:cs="仿宋_GB2312"/>
-          <w:b/>
-          <w:sz w:val="32"/>
-        </w:rPr>
-        <w:t>威布尔分布</w:t>
-      </w:r>
-      <w:r>
-        <w:rPr>
-          <w:rFonts w:ascii="仿宋_GB2312" w:hAnsi="仿宋_GB2312" w:eastAsia="仿宋_GB2312" w:cs="仿宋_GB2312"/>
-          <w:b w:val="0"/>
-          <w:sz w:val="32"/>
-        </w:rPr>
-        <w:t>描述寿命规律，最终输出剩余寿命、预计退役年份和四级预警。</w:t>
+        <w:t>这就进入第二颗决策大脑——千亩村发展导引模型和新建沙盘。关键创新在于：第一个模型的结果，不是停在健康看板上，而是直接进入第二个模型。我们把单栋健康分、容量和使用状态折算成“有效烤能”，再和村级烟叶需求比较。也就是说，一栋健康在用房、一栋闲置房、一栋待修房，不再简单按“1栋=1栋”统计。</w:t>
       </w:r>
     </w:p>
     <w:p>
       <w:pPr>
-        <w:spacing w:line="341" w:lineRule="auto" w:after="40"/>
+        <w:spacing w:line="324" w:lineRule="auto"/>
       </w:pPr>
       <w:r>
         <w:rPr>
           <w:rFonts w:ascii="黑体" w:hAnsi="黑体" w:eastAsia="黑体" w:cs="黑体"/>
           <w:b/>
-          <w:sz w:val="32"/>
+          <w:sz w:val="30"/>
+        </w:rPr>
+        <w:t>A：</w:t>
+      </w:r>
+      <w:r>
+        <w:rPr>
+          <w:rFonts w:ascii="仿宋_GB2312" w:hAnsi="仿宋_GB2312" w:eastAsia="仿宋_GB2312" w:cs="仿宋_GB2312"/>
+          <w:sz w:val="30"/>
+        </w:rPr>
+        <w:t>在村级层面，我们把“有效烤能”作为50%的核心项，把承载匹配作为30%，再把规模趋势、管护能力、政策支撑等发展因素作为20%，形成发展指数和新建需求分。主观权重用AHP确定，客观差异再用熵权法校验；进入候选建设范围后，再从地形、水文、电力、交通、烟田匹配、环境安全、集群效益、建设成本等维度，用TOPSIS对候选点排序。</w:t>
+      </w:r>
+    </w:p>
+    <w:p>
+      <w:pPr>
+        <w:spacing w:line="324" w:lineRule="auto"/>
+      </w:pPr>
+      <w:r>
+        <w:rPr>
+          <w:rFonts w:ascii="黑体" w:hAnsi="黑体" w:eastAsia="黑体" w:cs="黑体"/>
+          <w:b/>
+          <w:sz w:val="30"/>
         </w:rPr>
         <w:t>B：</w:t>
       </w:r>
       <w:r>
         <w:rPr>
           <w:rFonts w:ascii="仿宋_GB2312" w:hAnsi="仿宋_GB2312" w:eastAsia="仿宋_GB2312" w:cs="仿宋_GB2312"/>
-          <w:sz w:val="32"/>
+          <w:sz w:val="30"/>
         </w:rPr>
-        <w:t>那一栋用了十几年的老烤房，昨天刚换了新自控仪，会不会一下变成“新房”？</w:t>
+        <w:t>听起来像一个排名。它和普通的“打分选址”到底差在哪？</w:t>
       </w:r>
     </w:p>
     <w:p>
       <w:pPr>
-        <w:spacing w:line="341" w:lineRule="auto" w:after="40"/>
+        <w:spacing w:line="324" w:lineRule="auto"/>
       </w:pPr>
       <w:r>
         <w:rPr>
           <w:rFonts w:ascii="黑体" w:hAnsi="黑体" w:eastAsia="黑体" w:cs="黑体"/>
           <w:b/>
-          <w:sz w:val="32"/>
+          <w:sz w:val="30"/>
         </w:rPr>
         <w:t>A：</w:t>
       </w:r>
       <w:r>
         <w:rPr>
           <w:rFonts w:ascii="仿宋_GB2312" w:hAnsi="仿宋_GB2312" w:eastAsia="仿宋_GB2312" w:cs="仿宋_GB2312"/>
-          <w:b w:val="0"/>
-          <w:sz w:val="32"/>
+          <w:sz w:val="30"/>
         </w:rPr>
-        <w:t>不会。这就是我们的第一句技术口诀：</w:t>
-      </w:r>
-      <w:r>
-        <w:rPr>
-          <w:rFonts w:ascii="仿宋_GB2312" w:hAnsi="仿宋_GB2312" w:eastAsia="仿宋_GB2312" w:cs="仿宋_GB2312"/>
-          <w:b/>
-          <w:sz w:val="32"/>
-        </w:rPr>
-        <w:t>维修可以续命，但不能回春</w:t>
-      </w:r>
-      <w:r>
-        <w:rPr>
-          <w:rFonts w:ascii="仿宋_GB2312" w:hAnsi="仿宋_GB2312" w:eastAsia="仿宋_GB2312" w:cs="仿宋_GB2312"/>
-          <w:b w:val="0"/>
-          <w:sz w:val="32"/>
-        </w:rPr>
-        <w:t>。模型最终不是只给一个分数，而是同时给出“</w:t>
-      </w:r>
-      <w:r>
-        <w:rPr>
-          <w:rFonts w:ascii="仿宋_GB2312" w:hAnsi="仿宋_GB2312" w:eastAsia="仿宋_GB2312" w:cs="仿宋_GB2312"/>
-          <w:b/>
-          <w:sz w:val="32"/>
-        </w:rPr>
-        <w:t>五级健康、四级寿命预警、风险部件排序</w:t>
-      </w:r>
-      <w:r>
-        <w:rPr>
-          <w:rFonts w:ascii="仿宋_GB2312" w:hAnsi="仿宋_GB2312" w:eastAsia="仿宋_GB2312" w:cs="仿宋_GB2312"/>
-          <w:b w:val="0"/>
-          <w:sz w:val="32"/>
-        </w:rPr>
-        <w:t>”，直接告诉现场“修哪里、何时修、多紧急”。目前2442栋烤房全部完成健康评价，筛出340余栋60分以下低健康烤房，2026年已完成150栋设备靶向修复。</w:t>
-      </w:r>
-    </w:p>
-    <w:p>
-      <w:pPr>
-        <w:spacing w:line="341" w:lineRule="auto" w:after="40"/>
-      </w:pPr>
-      <w:r>
-        <w:rPr>
-          <w:rFonts w:ascii="黑体" w:hAnsi="黑体" w:eastAsia="黑体" w:cs="黑体"/>
-          <w:b/>
-          <w:sz w:val="32"/>
-        </w:rPr>
-        <w:t>B：</w:t>
-      </w:r>
-      <w:r>
-        <w:rPr>
-          <w:rFonts w:ascii="仿宋_GB2312" w:hAnsi="仿宋_GB2312" w:eastAsia="仿宋_GB2312" w:cs="仿宋_GB2312"/>
-          <w:sz w:val="32"/>
-        </w:rPr>
-        <w:t>第二问：能调的调了、能修的修了，如果一个村还是缺烤能，哪里该建？建多少？</w:t>
-      </w:r>
-    </w:p>
-    <w:p>
-      <w:pPr>
-        <w:spacing w:line="341" w:lineRule="auto" w:after="40"/>
-      </w:pPr>
-      <w:r>
-        <w:rPr>
-          <w:rFonts w:ascii="黑体" w:hAnsi="黑体" w:eastAsia="黑体" w:cs="黑体"/>
-          <w:b/>
-          <w:sz w:val="32"/>
-        </w:rPr>
-        <w:t>A：</w:t>
-      </w:r>
-      <w:r>
-        <w:rPr>
-          <w:rFonts w:ascii="仿宋_GB2312" w:hAnsi="仿宋_GB2312" w:eastAsia="仿宋_GB2312" w:cs="仿宋_GB2312"/>
-          <w:b w:val="0"/>
-          <w:sz w:val="32"/>
-        </w:rPr>
-        <w:t>这就是第二个模型——千亩村发展导引与新建沙盘。我们没有简单数“这个村有多少栋”，而是先把健康分、容量和使用状态折算成“</w:t>
-      </w:r>
-      <w:r>
-        <w:rPr>
-          <w:rFonts w:ascii="仿宋_GB2312" w:hAnsi="仿宋_GB2312" w:eastAsia="仿宋_GB2312" w:cs="仿宋_GB2312"/>
-          <w:b/>
-          <w:sz w:val="32"/>
-        </w:rPr>
-        <w:t>有效烤能</w:t>
-      </w:r>
-      <w:r>
-        <w:rPr>
-          <w:rFonts w:ascii="仿宋_GB2312" w:hAnsi="仿宋_GB2312" w:eastAsia="仿宋_GB2312" w:cs="仿宋_GB2312"/>
-          <w:b w:val="0"/>
-          <w:sz w:val="32"/>
-        </w:rPr>
-        <w:t>”，再和村级烟叶需求比较；进一步形成</w:t>
-      </w:r>
-      <w:r>
-        <w:rPr>
-          <w:rFonts w:ascii="仿宋_GB2312" w:hAnsi="仿宋_GB2312" w:eastAsia="仿宋_GB2312" w:cs="仿宋_GB2312"/>
-          <w:b/>
-          <w:sz w:val="32"/>
-        </w:rPr>
-        <w:t>有效烤能</w:t>
-      </w:r>
-      <w:r>
-        <w:rPr>
-          <w:rFonts w:ascii="仿宋_GB2312" w:hAnsi="仿宋_GB2312" w:eastAsia="仿宋_GB2312" w:cs="仿宋_GB2312"/>
-          <w:b w:val="0"/>
-          <w:sz w:val="32"/>
-        </w:rPr>
-        <w:t>指数、承载匹配指数和发展因子指数，按</w:t>
-      </w:r>
-      <w:r>
-        <w:rPr>
-          <w:rFonts w:ascii="仿宋_GB2312" w:hAnsi="仿宋_GB2312" w:eastAsia="仿宋_GB2312" w:cs="仿宋_GB2312"/>
-          <w:b/>
-          <w:sz w:val="32"/>
-        </w:rPr>
-        <w:t>50%、30%、20%</w:t>
-      </w:r>
-      <w:r>
-        <w:rPr>
-          <w:rFonts w:ascii="仿宋_GB2312" w:hAnsi="仿宋_GB2312" w:eastAsia="仿宋_GB2312" w:cs="仿宋_GB2312"/>
-          <w:b w:val="0"/>
-          <w:sz w:val="32"/>
-        </w:rPr>
-        <w:t>合成村级发展指数——指数越低，缺口越大，新建越迫切。</w:t>
-      </w:r>
-    </w:p>
-    <w:p>
-      <w:pPr>
-        <w:spacing w:line="341" w:lineRule="auto" w:after="40"/>
-      </w:pPr>
-      <w:r>
-        <w:rPr>
-          <w:rFonts w:ascii="黑体" w:hAnsi="黑体" w:eastAsia="黑体" w:cs="黑体"/>
-          <w:b/>
-          <w:sz w:val="32"/>
-        </w:rPr>
-        <w:t>B：</w:t>
-      </w:r>
-      <w:r>
-        <w:rPr>
-          <w:rFonts w:ascii="仿宋_GB2312" w:hAnsi="仿宋_GB2312" w:eastAsia="仿宋_GB2312" w:cs="仿宋_GB2312"/>
-          <w:sz w:val="32"/>
-        </w:rPr>
-        <w:t>可多指标一多，权重很容易又回到“拍脑袋”。你们怎么解决？</w:t>
-      </w:r>
-    </w:p>
-    <w:p>
-      <w:pPr>
-        <w:spacing w:line="341" w:lineRule="auto" w:after="40"/>
-      </w:pPr>
-      <w:r>
-        <w:rPr>
-          <w:rFonts w:ascii="黑体" w:hAnsi="黑体" w:eastAsia="黑体" w:cs="黑体"/>
-          <w:b/>
-          <w:sz w:val="32"/>
-        </w:rPr>
-        <w:t>A：</w:t>
-      </w:r>
-      <w:r>
-        <w:rPr>
-          <w:rFonts w:ascii="仿宋_GB2312" w:hAnsi="仿宋_GB2312" w:eastAsia="仿宋_GB2312" w:cs="仿宋_GB2312"/>
-          <w:b w:val="0"/>
-          <w:sz w:val="32"/>
-        </w:rPr>
-        <w:t>我们让业务和数据共同说话：</w:t>
-      </w:r>
-      <w:r>
-        <w:rPr>
-          <w:rFonts w:ascii="仿宋_GB2312" w:hAnsi="仿宋_GB2312" w:eastAsia="仿宋_GB2312" w:cs="仿宋_GB2312"/>
-          <w:b/>
-          <w:sz w:val="32"/>
-        </w:rPr>
-        <w:t>AHP</w:t>
-      </w:r>
-      <w:r>
-        <w:rPr>
-          <w:rFonts w:ascii="仿宋_GB2312" w:hAnsi="仿宋_GB2312" w:eastAsia="仿宋_GB2312" w:cs="仿宋_GB2312"/>
-          <w:b w:val="0"/>
-          <w:sz w:val="32"/>
-        </w:rPr>
-        <w:t>给出专家主观权重，</w:t>
-      </w:r>
-      <w:r>
-        <w:rPr>
-          <w:rFonts w:ascii="仿宋_GB2312" w:hAnsi="仿宋_GB2312" w:eastAsia="仿宋_GB2312" w:cs="仿宋_GB2312"/>
-          <w:b/>
-          <w:sz w:val="32"/>
-        </w:rPr>
-        <w:t>熵权法</w:t>
-      </w:r>
-      <w:r>
-        <w:rPr>
-          <w:rFonts w:ascii="仿宋_GB2312" w:hAnsi="仿宋_GB2312" w:eastAsia="仿宋_GB2312" w:cs="仿宋_GB2312"/>
-          <w:b w:val="0"/>
-          <w:sz w:val="32"/>
-        </w:rPr>
-        <w:t>根据数据差异给出客观权重，组合后完成权重校验；对进入建设范围的候选点，再从地形、水文、电力、交通、烟田匹配、环境安全、集群效益、建设成本等八个维度，用</w:t>
-      </w:r>
-      <w:r>
-        <w:rPr>
-          <w:rFonts w:ascii="仿宋_GB2312" w:hAnsi="仿宋_GB2312" w:eastAsia="仿宋_GB2312" w:cs="仿宋_GB2312"/>
-          <w:b/>
-          <w:sz w:val="32"/>
-        </w:rPr>
-        <w:t>TOPSIS</w:t>
-      </w:r>
-      <w:r>
-        <w:rPr>
-          <w:rFonts w:ascii="仿宋_GB2312" w:hAnsi="仿宋_GB2312" w:eastAsia="仿宋_GB2312" w:cs="仿宋_GB2312"/>
-          <w:b w:val="0"/>
-          <w:sz w:val="32"/>
-        </w:rPr>
-        <w:t>寻找“离理想点最近”的方案。</w:t>
-      </w:r>
-    </w:p>
-    <w:p>
-      <w:pPr>
-        <w:spacing w:line="341" w:lineRule="auto" w:after="40"/>
-      </w:pPr>
-      <w:r>
-        <w:rPr>
-          <w:rFonts w:ascii="黑体" w:hAnsi="黑体" w:eastAsia="黑体" w:cs="黑体"/>
-          <w:b/>
-          <w:sz w:val="32"/>
-        </w:rPr>
-        <w:t>B：</w:t>
-      </w:r>
-      <w:r>
-        <w:rPr>
-          <w:rFonts w:ascii="仿宋_GB2312" w:hAnsi="仿宋_GB2312" w:eastAsia="仿宋_GB2312" w:cs="仿宋_GB2312"/>
-          <w:b w:val="0"/>
-          <w:sz w:val="32"/>
-        </w:rPr>
-        <w:t>更关键的是，它不是一张静态排行榜。我们可以切换当前以及烟叶规模</w:t>
-      </w:r>
-      <w:r>
-        <w:rPr>
-          <w:rFonts w:ascii="仿宋_GB2312" w:hAnsi="仿宋_GB2312" w:eastAsia="仿宋_GB2312" w:cs="仿宋_GB2312"/>
-          <w:b/>
-          <w:sz w:val="32"/>
-        </w:rPr>
-        <w:t>增长2%、5%、10%</w:t>
-      </w:r>
-      <w:r>
-        <w:rPr>
-          <w:rFonts w:ascii="仿宋_GB2312" w:hAnsi="仿宋_GB2312" w:eastAsia="仿宋_GB2312" w:cs="仿宋_GB2312"/>
-          <w:b w:val="0"/>
-          <w:sz w:val="32"/>
-        </w:rPr>
-        <w:t>的情景，调整拟建栋数，系统立即重算新建前后的</w:t>
-      </w:r>
-      <w:r>
-        <w:rPr>
-          <w:rFonts w:ascii="仿宋_GB2312" w:hAnsi="仿宋_GB2312" w:eastAsia="仿宋_GB2312" w:cs="仿宋_GB2312"/>
-          <w:b/>
-          <w:sz w:val="32"/>
-        </w:rPr>
-        <w:t>有效烤能</w:t>
-      </w:r>
-      <w:r>
-        <w:rPr>
-          <w:rFonts w:ascii="仿宋_GB2312" w:hAnsi="仿宋_GB2312" w:eastAsia="仿宋_GB2312" w:cs="仿宋_GB2312"/>
-          <w:b w:val="0"/>
-          <w:sz w:val="32"/>
-        </w:rPr>
-        <w:t>、负载和发展指数。也就是说，在真正花钱之前，先把未来在屏幕上演一遍。</w:t>
-      </w:r>
-    </w:p>
-    <w:p>
-      <w:pPr>
-        <w:spacing w:line="341" w:lineRule="auto" w:after="40"/>
-      </w:pPr>
-      <w:r>
-        <w:rPr>
-          <w:rFonts w:ascii="黑体" w:hAnsi="黑体" w:eastAsia="黑体" w:cs="黑体"/>
-          <w:b/>
-          <w:sz w:val="32"/>
-        </w:rPr>
-        <w:t>A：</w:t>
-      </w:r>
-      <w:r>
-        <w:rPr>
-          <w:rFonts w:ascii="仿宋_GB2312" w:hAnsi="仿宋_GB2312" w:eastAsia="仿宋_GB2312" w:cs="仿宋_GB2312"/>
-          <w:sz w:val="32"/>
-        </w:rPr>
-        <w:t>2026年，这套方法辅助新建计划论证，争取县政府新建烤房29栋，其中梅家河乡肖家坪村7栋。</w:t>
-      </w:r>
-    </w:p>
-    <w:p>
-      <w:pPr>
-        <w:spacing w:line="341" w:lineRule="auto" w:after="40"/>
-      </w:pPr>
-      <w:r>
-        <w:rPr>
-          <w:rFonts w:ascii="黑体" w:hAnsi="黑体" w:eastAsia="黑体" w:cs="黑体"/>
-          <w:b/>
-          <w:sz w:val="32"/>
-        </w:rPr>
-        <w:t>B：</w:t>
-      </w:r>
-      <w:r>
-        <w:rPr>
-          <w:rFonts w:ascii="仿宋_GB2312" w:hAnsi="仿宋_GB2312" w:eastAsia="仿宋_GB2312" w:cs="仿宋_GB2312"/>
-          <w:sz w:val="32"/>
-        </w:rPr>
-        <w:t>那两个模型是不是各算各的？</w:t>
-      </w:r>
-    </w:p>
-    <w:p>
-      <w:pPr>
-        <w:spacing w:line="341" w:lineRule="auto" w:after="40"/>
-      </w:pPr>
-      <w:r>
-        <w:rPr>
-          <w:rFonts w:ascii="黑体" w:hAnsi="黑体" w:eastAsia="黑体" w:cs="黑体"/>
-          <w:b/>
-          <w:sz w:val="32"/>
-        </w:rPr>
-        <w:t>A：</w:t>
-      </w:r>
-      <w:r>
-        <w:rPr>
-          <w:rFonts w:ascii="仿宋_GB2312" w:hAnsi="仿宋_GB2312" w:eastAsia="仿宋_GB2312" w:cs="仿宋_GB2312"/>
-          <w:b w:val="0"/>
-          <w:sz w:val="32"/>
-        </w:rPr>
-        <w:t>恰恰相反。健康模型的输出，会进入第二个模型折算“</w:t>
-      </w:r>
-      <w:r>
-        <w:rPr>
-          <w:rFonts w:ascii="仿宋_GB2312" w:hAnsi="仿宋_GB2312" w:eastAsia="仿宋_GB2312" w:cs="仿宋_GB2312"/>
-          <w:b/>
-          <w:sz w:val="32"/>
-        </w:rPr>
-        <w:t>有效烤能</w:t>
-      </w:r>
-      <w:r>
-        <w:rPr>
-          <w:rFonts w:ascii="仿宋_GB2312" w:hAnsi="仿宋_GB2312" w:eastAsia="仿宋_GB2312" w:cs="仿宋_GB2312"/>
-          <w:b w:val="0"/>
-          <w:sz w:val="32"/>
-        </w:rPr>
-        <w:t>”。所以我们的投资逻辑不是“缺了就建”，而是“</w:t>
-      </w:r>
-      <w:r>
-        <w:rPr>
-          <w:rFonts w:ascii="仿宋_GB2312" w:hAnsi="仿宋_GB2312" w:eastAsia="仿宋_GB2312" w:cs="仿宋_GB2312"/>
-          <w:b/>
-          <w:sz w:val="32"/>
-        </w:rPr>
-        <w:t>先调剂、再修复，仍有结构性缺口才新建</w:t>
-      </w:r>
-      <w:r>
-        <w:rPr>
-          <w:rFonts w:ascii="仿宋_GB2312" w:hAnsi="仿宋_GB2312" w:eastAsia="仿宋_GB2312" w:cs="仿宋_GB2312"/>
-          <w:b w:val="0"/>
-          <w:sz w:val="32"/>
-        </w:rPr>
-        <w:t>”。这也是我们和普通烤房信息系统最大的区别——模型不是两张图，而是一条从存量盘活到增量建设的决策链。</w:t>
-      </w:r>
-    </w:p>
-    <w:p>
-      <w:pPr>
-        <w:spacing w:line="341" w:lineRule="auto" w:after="40"/>
-      </w:pPr>
-      <w:r>
-        <w:rPr>
-          <w:rFonts w:ascii="黑体" w:hAnsi="黑体" w:eastAsia="黑体" w:cs="黑体"/>
-          <w:b/>
-          <w:sz w:val="32"/>
-        </w:rPr>
-        <w:t>A：</w:t>
-      </w:r>
-      <w:r>
-        <w:rPr>
-          <w:rFonts w:ascii="仿宋_GB2312" w:hAnsi="仿宋_GB2312" w:eastAsia="仿宋_GB2312" w:cs="仿宋_GB2312"/>
-          <w:sz w:val="32"/>
-        </w:rPr>
-        <w:t>下面请用35秒，看这条决策链怎样真正跑起来。</w:t>
+        <w:t>差在“能推演”。我们把当前烟叶规模切换到增长2%、5%、10%等不同情景，系统会实时重算有效烤能、承载压力、发展指数和拟建数量；再落下一处候选点，看新增以后负载到底降了多少。它不是告诉管理者“这里排第一”，而是在真正花钱之前，先把未来在屏幕上演一遍。项目组已将这套方法用于2026年建设方案论证，争取县政府新建烤房29栋，其中梅家河乡肖家坪村7栋。</w:t>
       </w:r>
     </w:p>
     <w:tbl>
       <w:tblPr>
         <w:tblW w:type="auto" w:w="0"/>
-        <w:jc w:val="center"/>
         <w:tblLook w:firstColumn="1" w:firstRow="1" w:lastColumn="0" w:lastRow="0" w:noHBand="0" w:noVBand="1" w:val="04A0"/>
       </w:tblPr>
       <w:tblGrid>
-        <w:gridCol w:w="9406"/>
+        <w:gridCol w:w="9632"/>
       </w:tblGrid>
       <w:tr>
         <w:tc>
           <w:tcPr>
-            <w:tcW w:type="dxa" w:w="9406"/>
+            <w:tcW w:type="dxa" w:w="9632"/>
             <w:shd w:fill="FFF2CC"/>
           </w:tcPr>
           <w:p>
-            <w:pPr>
-              <w:spacing w:after="0"/>
-              <w:ind w:left="85" w:right="85"/>
-            </w:pPr>
+            <w:r/>
             <w:r>
               <w:rPr>
                 <w:rFonts w:ascii="黑体" w:hAnsi="黑体" w:eastAsia="黑体" w:cs="黑体"/>
@@ -1461,7 +1015,7 @@
                 <w:rFonts w:ascii="楷体_GB2312" w:hAnsi="楷体_GB2312" w:eastAsia="楷体_GB2312" w:cs="楷体_GB2312"/>
                 <w:sz w:val="22"/>
               </w:rPr>
-              <w:t>35秒视频：一栋一档→健康分/寿命/风险部件→在线调剂/一键报修→村级沙盘切换5%增长→新增点位前后负载变化→合作社工单闭环。</w:t>
+              <w:t>地图点开单栋烤房→展示健康分、剩余寿命、风险部件→切换村级沙盘“增长5%”→负载与推荐方案重算→新增候选点前后对比→一键报修、配件与人员匹配→合作社工单闭环。旁白：“先看清存量，再推演增量，让每一次维修和每一笔新建投入都有依据。”</w:t>
             </w:r>
           </w:p>
         </w:tc>
@@ -1469,355 +1023,234 @@
     </w:tbl>
     <w:p>
       <w:pPr>
-        <w:spacing w:after="0"/>
-      </w:pPr>
-    </w:p>
-    <w:p>
-      <w:pPr>
-        <w:spacing w:line="341" w:lineRule="auto" w:after="40"/>
+        <w:spacing w:line="324" w:lineRule="auto"/>
       </w:pPr>
       <w:r>
         <w:rPr>
           <w:rFonts w:ascii="黑体" w:hAnsi="黑体" w:eastAsia="黑体" w:cs="黑体"/>
           <w:b/>
-          <w:sz w:val="32"/>
+          <w:sz w:val="30"/>
         </w:rPr>
         <w:t>B：</w:t>
       </w:r>
       <w:r>
         <w:rPr>
           <w:rFonts w:ascii="仿宋_GB2312" w:hAnsi="仿宋_GB2312" w:eastAsia="仿宋_GB2312" w:cs="仿宋_GB2312"/>
-          <w:sz w:val="32"/>
+          <w:sz w:val="30"/>
         </w:rPr>
         <w:t>模型算得再准，最终还得有人用、有人管。</w:t>
       </w:r>
     </w:p>
     <w:p>
       <w:pPr>
-        <w:spacing w:line="341" w:lineRule="auto" w:after="40"/>
+        <w:spacing w:line="324" w:lineRule="auto"/>
       </w:pPr>
       <w:r>
         <w:rPr>
           <w:rFonts w:ascii="黑体" w:hAnsi="黑体" w:eastAsia="黑体" w:cs="黑体"/>
           <w:b/>
-          <w:sz w:val="32"/>
+          <w:sz w:val="30"/>
+        </w:rPr>
+        <w:t>B：</w:t>
+      </w:r>
+      <w:r>
+        <w:rPr>
+          <w:rFonts w:ascii="仿宋_GB2312" w:hAnsi="仿宋_GB2312" w:eastAsia="仿宋_GB2312" w:cs="仿宋_GB2312"/>
+          <w:sz w:val="30"/>
+        </w:rPr>
+        <w:t>所以我们把决策落到“智用、智投、智管”三个场景。智用服务烟农：在线调剂、一键报修；智投服务管理部门：按健康和沙盘结果安排修复、新建和资金；智管服务合作社：组建烟叶调制、紧急抢修、日常管护、综合管理四支服务队，把申请、派单、验收、评价和资金纳入闭环，探索“管家自治”。平台还将模型结果回写数据库，通过Web、小程序、BI大屏和AI查询助手统一展示。</w:t>
+      </w:r>
+    </w:p>
+    <w:p>
+      <w:pPr>
+        <w:spacing w:line="324" w:lineRule="auto"/>
+      </w:pPr>
+      <w:r>
+        <w:rPr>
+          <w:rFonts w:ascii="黑体" w:hAnsi="黑体" w:eastAsia="黑体" w:cs="黑体"/>
+          <w:b/>
+          <w:sz w:val="30"/>
+        </w:rPr>
+        <w:t>B：</w:t>
+      </w:r>
+      <w:r>
+        <w:rPr>
+          <w:rFonts w:ascii="仿宋_GB2312" w:hAnsi="仿宋_GB2312" w:eastAsia="仿宋_GB2312" w:cs="仿宋_GB2312"/>
+          <w:sz w:val="30"/>
+        </w:rPr>
+        <w:t>磨坪的场景最直观。50栋烤房截至9月5日累计完成115炕次、1380担，通过调剂增加约185担烘烤量。8月一栋烤房遭雷击，从一键报修、故障排查到就近配件和维修人员匹配，全程不到3小时，比传统处置平均缩短约2小时。</w:t>
+      </w:r>
+    </w:p>
+    <w:p>
+      <w:pPr>
+        <w:spacing w:line="324" w:lineRule="auto"/>
+      </w:pPr>
+      <w:r>
+        <w:rPr>
+          <w:rFonts w:ascii="黑体" w:hAnsi="黑体" w:eastAsia="黑体" w:cs="黑体"/>
+          <w:b/>
+          <w:sz w:val="30"/>
         </w:rPr>
         <w:t>A：</w:t>
       </w:r>
       <w:r>
         <w:rPr>
           <w:rFonts w:ascii="仿宋_GB2312" w:hAnsi="仿宋_GB2312" w:eastAsia="仿宋_GB2312" w:cs="仿宋_GB2312"/>
-          <w:b w:val="0"/>
-          <w:sz w:val="32"/>
+          <w:sz w:val="30"/>
         </w:rPr>
-        <w:t>所以我们把决策落到“</w:t>
-      </w:r>
-      <w:r>
-        <w:rPr>
-          <w:rFonts w:ascii="仿宋_GB2312" w:hAnsi="仿宋_GB2312" w:eastAsia="仿宋_GB2312" w:cs="仿宋_GB2312"/>
-          <w:b/>
-          <w:sz w:val="32"/>
-        </w:rPr>
-        <w:t>智用、智投、智管</w:t>
-      </w:r>
-      <w:r>
-        <w:rPr>
-          <w:rFonts w:ascii="仿宋_GB2312" w:hAnsi="仿宋_GB2312" w:eastAsia="仿宋_GB2312" w:cs="仿宋_GB2312"/>
-          <w:b w:val="0"/>
-          <w:sz w:val="32"/>
-        </w:rPr>
-        <w:t>”三个场景：智用服务烟农，在线调剂、一键报修；智投服务管理部门，按健康和沙盘结果安排修复、新建和资金；智管服务合作社，组建烟叶调制、紧急抢修、日常管护、综合管理四支队伍，把申请、派单、验收、评价和资金纳入闭环，探索“</w:t>
-      </w:r>
-      <w:r>
-        <w:rPr>
-          <w:rFonts w:ascii="仿宋_GB2312" w:hAnsi="仿宋_GB2312" w:eastAsia="仿宋_GB2312" w:cs="仿宋_GB2312"/>
-          <w:b/>
-          <w:sz w:val="32"/>
-        </w:rPr>
-        <w:t>管家自治</w:t>
-      </w:r>
-      <w:r>
-        <w:rPr>
-          <w:rFonts w:ascii="仿宋_GB2312" w:hAnsi="仿宋_GB2312" w:eastAsia="仿宋_GB2312" w:cs="仿宋_GB2312"/>
-          <w:b w:val="0"/>
-          <w:sz w:val="32"/>
-        </w:rPr>
-        <w:t>”。</w:t>
+        <w:t>放到全县看，一个烘烤季下来，系统完成48次烤房调剂；16条抢修工单平均响应0.38小时；531份有效问卷综合满意度达到96.8%；两级合作社统筹管护1363栋，占本年度在用烤房81%，管护基金累计近190万元。数据、模型、业务和机制，真正开始转起来。</w:t>
       </w:r>
     </w:p>
     <w:p>
       <w:pPr>
-        <w:spacing w:line="341" w:lineRule="auto" w:after="40"/>
+        <w:spacing w:line="324" w:lineRule="auto"/>
       </w:pPr>
       <w:r>
         <w:rPr>
           <w:rFonts w:ascii="黑体" w:hAnsi="黑体" w:eastAsia="黑体" w:cs="黑体"/>
           <w:b/>
-          <w:sz w:val="32"/>
+          <w:sz w:val="30"/>
+        </w:rPr>
+        <w:t>A：</w:t>
+      </w:r>
+      <w:r>
+        <w:rPr>
+          <w:rFonts w:ascii="仿宋_GB2312" w:hAnsi="仿宋_GB2312" w:eastAsia="仿宋_GB2312" w:cs="仿宋_GB2312"/>
+          <w:sz w:val="30"/>
+        </w:rPr>
+        <w:t>各位评委，如果只记住我们的创新，我希望是三句话。第一，不是给烤房做一张静态档案，而是做“健康—寿命—风险—维修”的动态体检；第二，不是两个模型各算各的，而是健康结果进入有效烤能，形成“先调剂、再修复、仍有结构性缺口才新建”的决策链；第三，不是给建设项目排一次名，而是用沙盘反复推演“现在缺不缺、未来缺多少、建了以后有没有用”。</w:t>
+      </w:r>
+    </w:p>
+    <w:p>
+      <w:pPr>
+        <w:spacing w:line="324" w:lineRule="auto"/>
+      </w:pPr>
+      <w:r>
+        <w:rPr>
+          <w:rFonts w:ascii="黑体" w:hAnsi="黑体" w:eastAsia="黑体" w:cs="黑体"/>
+          <w:b/>
+          <w:sz w:val="30"/>
         </w:rPr>
         <w:t>B：</w:t>
       </w:r>
       <w:r>
         <w:rPr>
           <w:rFonts w:ascii="仿宋_GB2312" w:hAnsi="仿宋_GB2312" w:eastAsia="仿宋_GB2312" w:cs="仿宋_GB2312"/>
-          <w:sz w:val="32"/>
+          <w:sz w:val="30"/>
         </w:rPr>
-        <w:t>今年8月，磨坪一栋烤房遭遇雷击，平台从一键报修、风险诊断，到匹配就近配件和维修人员，全程不到3小时，较传统处置平均缩短约2小时。</w:t>
+        <w:t>也就是：好房充分用，旧房精准修，缺口科学建，建后持续管。</w:t>
       </w:r>
     </w:p>
     <w:p>
       <w:pPr>
-        <w:spacing w:line="341" w:lineRule="auto" w:after="40"/>
+        <w:spacing w:line="324" w:lineRule="auto"/>
       </w:pPr>
       <w:r>
         <w:rPr>
           <w:rFonts w:ascii="黑体" w:hAnsi="黑体" w:eastAsia="黑体" w:cs="黑体"/>
           <w:b/>
-          <w:sz w:val="32"/>
+          <w:sz w:val="30"/>
         </w:rPr>
         <w:t>A：</w:t>
       </w:r>
       <w:r>
         <w:rPr>
           <w:rFonts w:ascii="仿宋_GB2312" w:hAnsi="仿宋_GB2312" w:eastAsia="仿宋_GB2312" w:cs="仿宋_GB2312"/>
-          <w:sz w:val="32"/>
+          <w:sz w:val="30"/>
         </w:rPr>
-        <w:t>这套体系运行一个烘烤季，四组结果最能说明问题：2442座烤房全部入库；完成48次烤房调剂，16条抢修工单平均响应0.38小时；531份有效问卷综合满意度96.8%；两级合作社统筹管护1363栋，占本年度在用烤房81%，管护基金累计近190万元。</w:t>
+        <w:t>从“有多少房”到“有多少有效烤能”，从“坏了才修”到“提前预警”，从“凭经验投”到“沙盘推演”。这就是智烤管家。聚数成方，一脉致远，让每一栋烤房发挥最大价值！我们的汇报完毕，谢谢大家！</w:t>
       </w:r>
     </w:p>
     <w:p>
       <w:pPr>
-        <w:spacing w:line="341" w:lineRule="auto" w:after="40"/>
+        <w:pStyle w:val="Heading1"/>
+        <w:spacing w:before="160" w:after="80"/>
       </w:pPr>
       <w:r>
         <w:rPr>
           <w:rFonts w:ascii="黑体" w:hAnsi="黑体" w:eastAsia="黑体" w:cs="黑体"/>
           <w:b/>
-          <w:sz w:val="32"/>
+          <w:sz w:val="36"/>
         </w:rPr>
-        <w:t>B：</w:t>
-      </w:r>
-      <w:r>
-        <w:rPr>
-          <w:rFonts w:ascii="仿宋_GB2312" w:hAnsi="仿宋_GB2312" w:eastAsia="仿宋_GB2312" w:cs="仿宋_GB2312"/>
-          <w:sz w:val="32"/>
-        </w:rPr>
-        <w:t>从烟农到烟站再到合作社，开场的“三愁”有了同一条解决链。</w:t>
+        <w:t>三、现场重音与停顿</w:t>
       </w:r>
     </w:p>
     <w:p>
       <w:pPr>
-        <w:spacing w:line="341" w:lineRule="auto" w:after="40"/>
+        <w:spacing w:line="324" w:lineRule="auto"/>
       </w:pPr>
       <w:r>
         <w:rPr>
-          <w:rFonts w:ascii="黑体" w:hAnsi="黑体" w:eastAsia="黑体" w:cs="黑体"/>
-          <w:b/>
-          <w:sz w:val="32"/>
+          <w:rFonts w:ascii="仿宋_GB2312" w:hAnsi="仿宋_GB2312" w:eastAsia="仿宋_GB2312" w:cs="仿宋_GB2312"/>
+          <w:sz w:val="26"/>
         </w:rPr>
-        <w:t>A：</w:t>
-      </w:r>
-      <w:r>
-        <w:rPr>
-          <w:rFonts w:ascii="仿宋_GB2312" w:hAnsi="仿宋_GB2312" w:eastAsia="仿宋_GB2312" w:cs="仿宋_GB2312"/>
-          <w:b w:val="0"/>
-          <w:sz w:val="32"/>
-        </w:rPr>
-        <w:t>如果让评委只记住一句话，我希望大家记住我们的“</w:t>
-      </w:r>
-      <w:r>
-        <w:rPr>
-          <w:rFonts w:ascii="仿宋_GB2312" w:hAnsi="仿宋_GB2312" w:eastAsia="仿宋_GB2312" w:cs="仿宋_GB2312"/>
-          <w:b/>
-          <w:sz w:val="32"/>
-        </w:rPr>
-        <w:t>1234</w:t>
-      </w:r>
-      <w:r>
-        <w:rPr>
-          <w:rFonts w:ascii="仿宋_GB2312" w:hAnsi="仿宋_GB2312" w:eastAsia="仿宋_GB2312" w:cs="仿宋_GB2312"/>
-          <w:b w:val="0"/>
-          <w:sz w:val="32"/>
-        </w:rPr>
-        <w:t>”：</w:t>
-      </w:r>
-      <w:r>
-        <w:rPr>
-          <w:rFonts w:ascii="仿宋_GB2312" w:hAnsi="仿宋_GB2312" w:eastAsia="仿宋_GB2312" w:cs="仿宋_GB2312"/>
-          <w:b/>
-          <w:sz w:val="32"/>
-        </w:rPr>
-        <w:t>一库清底、双模决策、三智协同、四队长效</w:t>
-      </w:r>
-      <w:r>
-        <w:rPr>
-          <w:rFonts w:ascii="仿宋_GB2312" w:hAnsi="仿宋_GB2312" w:eastAsia="仿宋_GB2312" w:cs="仿宋_GB2312"/>
-          <w:b w:val="0"/>
-          <w:sz w:val="32"/>
-        </w:rPr>
-        <w:t>。再记住</w:t>
-      </w:r>
-      <w:r>
-        <w:rPr>
-          <w:rFonts w:ascii="仿宋_GB2312" w:hAnsi="仿宋_GB2312" w:eastAsia="仿宋_GB2312" w:cs="仿宋_GB2312"/>
-          <w:b/>
-          <w:sz w:val="32"/>
-        </w:rPr>
-        <w:t>三个“不是”</w:t>
-      </w:r>
-      <w:r>
-        <w:rPr>
-          <w:rFonts w:ascii="仿宋_GB2312" w:hAnsi="仿宋_GB2312" w:eastAsia="仿宋_GB2312" w:cs="仿宋_GB2312"/>
-          <w:b w:val="0"/>
-          <w:sz w:val="32"/>
-        </w:rPr>
-        <w:t>——不是建一套台账，而是让每栋烤房可计算；不是做一个评分，而是让模型直接驱动维修和投入；不是给一张静态排名，而是让建设方案能够反复推演。</w:t>
+        <w:t>• 前三句每句后停半拍。</w:t>
       </w:r>
     </w:p>
     <w:p>
       <w:pPr>
-        <w:spacing w:line="341" w:lineRule="auto" w:after="40"/>
+        <w:spacing w:line="324" w:lineRule="auto"/>
       </w:pPr>
       <w:r>
         <w:rPr>
-          <w:rFonts w:ascii="黑体" w:hAnsi="黑体" w:eastAsia="黑体" w:cs="黑体"/>
-          <w:b/>
-          <w:sz w:val="32"/>
+          <w:rFonts w:ascii="仿宋_GB2312" w:hAnsi="仿宋_GB2312" w:eastAsia="仿宋_GB2312" w:cs="仿宋_GB2312"/>
+          <w:sz w:val="26"/>
         </w:rPr>
-        <w:t>B：</w:t>
-      </w:r>
-      <w:r>
-        <w:rPr>
-          <w:rFonts w:ascii="仿宋_GB2312" w:hAnsi="仿宋_GB2312" w:eastAsia="仿宋_GB2312" w:cs="仿宋_GB2312"/>
-          <w:sz w:val="32"/>
-        </w:rPr>
-        <w:t>让好房充分用、旧房精准修、缺口科学建、建后持续管。</w:t>
+        <w:t>• “1234”四个词逐个打出来。</w:t>
       </w:r>
     </w:p>
     <w:p>
       <w:pPr>
-        <w:spacing w:line="341" w:lineRule="auto" w:after="40"/>
+        <w:spacing w:line="324" w:lineRule="auto"/>
       </w:pPr>
       <w:r>
         <w:rPr>
-          <w:rFonts w:ascii="黑体" w:hAnsi="黑体" w:eastAsia="黑体" w:cs="黑体"/>
-          <w:b/>
-          <w:sz w:val="32"/>
+          <w:rFonts w:ascii="仿宋_GB2312" w:hAnsi="仿宋_GB2312" w:eastAsia="仿宋_GB2312" w:cs="仿宋_GB2312"/>
+          <w:sz w:val="26"/>
         </w:rPr>
-        <w:t>A：</w:t>
-      </w:r>
-      <w:r>
-        <w:rPr>
-          <w:rFonts w:ascii="仿宋_GB2312" w:hAnsi="仿宋_GB2312" w:eastAsia="仿宋_GB2312" w:cs="仿宋_GB2312"/>
-          <w:sz w:val="32"/>
-        </w:rPr>
-        <w:t>聚数成方，一脉致远，让烤房发挥最大价值！我们的汇报完毕，谢谢大家！</w:t>
+        <w:t>• “维修可以续命，但不能回春”必须重读。</w:t>
       </w:r>
     </w:p>
     <w:p>
       <w:pPr>
-        <w:pStyle w:val="Heading1"/>
-        <w:spacing w:before="180" w:after="80"/>
+        <w:spacing w:line="324" w:lineRule="auto"/>
       </w:pPr>
       <w:r>
-        <w:t>三、现场重音提示（不念）</w:t>
+        <w:rPr>
+          <w:rFonts w:ascii="仿宋_GB2312" w:hAnsi="仿宋_GB2312" w:eastAsia="仿宋_GB2312" w:cs="仿宋_GB2312"/>
+          <w:sz w:val="26"/>
+        </w:rPr>
+        <w:t>• “有效烤能”第一次出现时PPT同步折算动画。</w:t>
       </w:r>
     </w:p>
     <w:p>
       <w:pPr>
-        <w:ind w:left="454" w:hanging="227"/>
+        <w:spacing w:line="324" w:lineRule="auto"/>
       </w:pPr>
       <w:r>
         <w:rPr>
           <w:rFonts w:ascii="仿宋_GB2312" w:hAnsi="仿宋_GB2312" w:eastAsia="仿宋_GB2312" w:cs="仿宋_GB2312"/>
-          <w:b/>
-          <w:sz w:val="28"/>
+          <w:sz w:val="26"/>
         </w:rPr>
-        <w:t>• 三类主体“三愁”</w:t>
+        <w:t>• “先调剂、再修复、仍有结构性缺口才新建”建议整句单独一屏。</w:t>
       </w:r>
     </w:p>
     <w:p>
       <w:pPr>
-        <w:ind w:left="454" w:hanging="227"/>
+        <w:spacing w:line="324" w:lineRule="auto"/>
       </w:pPr>
       <w:r>
         <w:rPr>
           <w:rFonts w:ascii="仿宋_GB2312" w:hAnsi="仿宋_GB2312" w:eastAsia="仿宋_GB2312" w:cs="仿宋_GB2312"/>
-          <w:b/>
-          <w:sz w:val="28"/>
+          <w:sz w:val="26"/>
         </w:rPr>
-        <w:t>• 1234：一库清底、双模决策、三智协同、四队长效</w:t>
-      </w:r>
-    </w:p>
-    <w:p>
-      <w:pPr>
-        <w:ind w:left="454" w:hanging="227"/>
-      </w:pPr>
-      <w:r>
-        <w:rPr>
-          <w:rFonts w:ascii="仿宋_GB2312" w:hAnsi="仿宋_GB2312" w:eastAsia="仿宋_GB2312" w:cs="仿宋_GB2312"/>
-          <w:b/>
-          <w:sz w:val="28"/>
-        </w:rPr>
-        <w:t>• 维修可以续命，但不能回春</w:t>
-      </w:r>
-    </w:p>
-    <w:p>
-      <w:pPr>
-        <w:ind w:left="454" w:hanging="227"/>
-      </w:pPr>
-      <w:r>
-        <w:rPr>
-          <w:rFonts w:ascii="仿宋_GB2312" w:hAnsi="仿宋_GB2312" w:eastAsia="仿宋_GB2312" w:cs="仿宋_GB2312"/>
-          <w:b/>
-          <w:sz w:val="28"/>
-        </w:rPr>
-        <w:t>• 有效烤能</w:t>
-      </w:r>
-    </w:p>
-    <w:p>
-      <w:pPr>
-        <w:ind w:left="454" w:hanging="227"/>
-      </w:pPr>
-      <w:r>
-        <w:rPr>
-          <w:rFonts w:ascii="仿宋_GB2312" w:hAnsi="仿宋_GB2312" w:eastAsia="仿宋_GB2312" w:cs="仿宋_GB2312"/>
-          <w:b/>
-          <w:sz w:val="28"/>
-        </w:rPr>
-        <w:t>• 在真正花钱之前，先把未来在屏幕上演一遍</w:t>
-      </w:r>
-    </w:p>
-    <w:p>
-      <w:pPr>
-        <w:ind w:left="454" w:hanging="227"/>
-      </w:pPr>
-      <w:r>
-        <w:rPr>
-          <w:rFonts w:ascii="仿宋_GB2312" w:hAnsi="仿宋_GB2312" w:eastAsia="仿宋_GB2312" w:cs="仿宋_GB2312"/>
-          <w:b/>
-          <w:sz w:val="28"/>
-        </w:rPr>
-        <w:t>• 先调剂、再修复，仍有结构性缺口才新建</w:t>
-      </w:r>
-    </w:p>
-    <w:p>
-      <w:pPr>
-        <w:ind w:left="454" w:hanging="227"/>
-      </w:pPr>
-      <w:r>
-        <w:rPr>
-          <w:rFonts w:ascii="仿宋_GB2312" w:hAnsi="仿宋_GB2312" w:eastAsia="仿宋_GB2312" w:cs="仿宋_GB2312"/>
-          <w:b/>
-          <w:sz w:val="28"/>
-        </w:rPr>
-        <w:t>• 三个“不是”</w:t>
+        <w:t>• 最后三组“从……到……”语速放慢，结束前留1秒。</w:t>
       </w:r>
     </w:p>
     <w:sectPr>
       <w:footerReference w:type="default" r:id="rId9"/>
       <w:pgSz w:w="12240" w:h="15840"/>
-      <w:pgMar w:top="1247" w:right="1417" w:bottom="1191" w:left="1417" w:header="720" w:footer="720" w:gutter="0"/>
+      <w:pgMar w:top="1134" w:right="1304" w:bottom="1134" w:left="1304" w:header="720" w:footer="720" w:gutter="0"/>
       <w:cols w:space="720"/>
       <w:docGrid w:linePitch="360"/>
     </w:sectPr>
@@ -1836,7 +1269,7 @@
       <w:rPr>
         <w:rFonts w:ascii="仿宋_GB2312" w:hAnsi="仿宋_GB2312" w:eastAsia="仿宋_GB2312" w:cs="仿宋_GB2312"/>
         <w:b w:val="0"/>
-        <w:color w:val="787878"/>
+        <w:color w:val="6E6E6E"/>
         <w:sz w:val="18"/>
       </w:rPr>
       <w:t>智烤管家 · 湖北省创客大赛决赛发布材料 · 09300004</w:t>
@@ -2209,11 +1642,11 @@
     <w:qFormat/>
     <w:rsid w:val="00FC693F"/>
     <w:pPr>
-      <w:spacing w:line="348" w:lineRule="auto" w:after="0"/>
+      <w:spacing w:line="324" w:lineRule="auto"/>
     </w:pPr>
     <w:rPr>
       <w:rFonts w:ascii="仿宋_GB2312" w:hAnsi="仿宋_GB2312" w:eastAsia="仿宋_GB2312"/>
-      <w:sz w:val="32"/>
+      <w:sz w:val="30"/>
     </w:rPr>
   </w:style>
   <w:style w:type="paragraph" w:styleId="Header">

</xml_diff>